<commit_message>
Corregidos documentos de casos de prueba
</commit_message>
<xml_diff>
--- a/test/AppForSEII2526.UIT/RentalCars/Casos de Prueba_UC2.docx
+++ b/test/AppForSEII2526.UIT/RentalCars/Casos de Prueba_UC2.docx
@@ -749,14 +749,16 @@
       <w:pPr>
         <w:pStyle w:val="TDC1"/>
         <w:tabs>
-          <w:tab w:val="left" w:pos="432"/>
+          <w:tab w:val="left" w:pos="864"/>
         </w:tabs>
         <w:rPr>
           <w:rFonts w:asciiTheme="minorHAnsi" w:eastAsiaTheme="minorEastAsia" w:hAnsiTheme="minorHAnsi" w:cstheme="minorBidi"/>
           <w:noProof/>
-          <w:sz w:val="22"/>
-          <w:szCs w:val="22"/>
+          <w:kern w:val="2"/>
+          <w:sz w:val="24"/>
+          <w:szCs w:val="24"/>
           <w:lang w:val="es-ES" w:eastAsia="es-ES"/>
+          <w14:ligatures w14:val="standardContextual"/>
         </w:rPr>
       </w:pPr>
       <w:r>
@@ -790,9 +792,11 @@
         <w:rPr>
           <w:rFonts w:asciiTheme="minorHAnsi" w:eastAsiaTheme="minorEastAsia" w:hAnsiTheme="minorHAnsi" w:cstheme="minorBidi"/>
           <w:noProof/>
-          <w:sz w:val="22"/>
-          <w:szCs w:val="22"/>
+          <w:kern w:val="2"/>
+          <w:sz w:val="24"/>
+          <w:szCs w:val="24"/>
           <w:lang w:val="es-ES" w:eastAsia="es-ES"/>
+          <w14:ligatures w14:val="standardContextual"/>
         </w:rPr>
         <w:tab/>
       </w:r>
@@ -806,7 +810,6 @@
       <w:r>
         <w:rPr>
           <w:noProof/>
-          <w:lang w:val="es-ES"/>
         </w:rPr>
         <w:tab/>
       </w:r>
@@ -819,9 +822,8 @@
       <w:r>
         <w:rPr>
           <w:noProof/>
-          <w:lang w:val="es-ES"/>
-        </w:rPr>
-        <w:instrText xml:space="preserve"> PAGEREF _Toc278820252 \h </w:instrText>
+        </w:rPr>
+        <w:instrText xml:space="preserve"> PAGEREF _Toc216897049 \h </w:instrText>
       </w:r>
       <w:r>
         <w:rPr>
@@ -837,7 +839,6 @@
       <w:r>
         <w:rPr>
           <w:noProof/>
-          <w:lang w:val="es-ES"/>
         </w:rPr>
         <w:t>1</w:t>
       </w:r>
@@ -852,14 +853,16 @@
       <w:pPr>
         <w:pStyle w:val="TDC1"/>
         <w:tabs>
-          <w:tab w:val="left" w:pos="432"/>
+          <w:tab w:val="left" w:pos="864"/>
         </w:tabs>
         <w:rPr>
           <w:rFonts w:asciiTheme="minorHAnsi" w:eastAsiaTheme="minorEastAsia" w:hAnsiTheme="minorHAnsi" w:cstheme="minorBidi"/>
           <w:noProof/>
-          <w:sz w:val="22"/>
-          <w:szCs w:val="22"/>
+          <w:kern w:val="2"/>
+          <w:sz w:val="24"/>
+          <w:szCs w:val="24"/>
           <w:lang w:val="es-ES" w:eastAsia="es-ES"/>
+          <w14:ligatures w14:val="standardContextual"/>
         </w:rPr>
       </w:pPr>
       <w:r>
@@ -873,9 +876,11 @@
         <w:rPr>
           <w:rFonts w:asciiTheme="minorHAnsi" w:eastAsiaTheme="minorEastAsia" w:hAnsiTheme="minorHAnsi" w:cstheme="minorBidi"/>
           <w:noProof/>
-          <w:sz w:val="22"/>
-          <w:szCs w:val="22"/>
+          <w:kern w:val="2"/>
+          <w:sz w:val="24"/>
+          <w:szCs w:val="24"/>
           <w:lang w:val="es-ES" w:eastAsia="es-ES"/>
+          <w14:ligatures w14:val="standardContextual"/>
         </w:rPr>
         <w:tab/>
       </w:r>
@@ -889,7 +894,6 @@
       <w:r>
         <w:rPr>
           <w:noProof/>
-          <w:lang w:val="es-ES"/>
         </w:rPr>
         <w:tab/>
       </w:r>
@@ -902,9 +906,8 @@
       <w:r>
         <w:rPr>
           <w:noProof/>
-          <w:lang w:val="es-ES"/>
-        </w:rPr>
-        <w:instrText xml:space="preserve"> PAGEREF _Toc278820253 \h </w:instrText>
+        </w:rPr>
+        <w:instrText xml:space="preserve"> PAGEREF _Toc216897050 \h </w:instrText>
       </w:r>
       <w:r>
         <w:rPr>
@@ -920,7 +923,6 @@
       <w:r>
         <w:rPr>
           <w:noProof/>
-          <w:lang w:val="es-ES"/>
         </w:rPr>
         <w:t>1</w:t>
       </w:r>
@@ -935,14 +937,16 @@
       <w:pPr>
         <w:pStyle w:val="TDC1"/>
         <w:tabs>
-          <w:tab w:val="left" w:pos="432"/>
+          <w:tab w:val="left" w:pos="864"/>
         </w:tabs>
         <w:rPr>
           <w:rFonts w:asciiTheme="minorHAnsi" w:eastAsiaTheme="minorEastAsia" w:hAnsiTheme="minorHAnsi" w:cstheme="minorBidi"/>
           <w:noProof/>
-          <w:sz w:val="22"/>
-          <w:szCs w:val="22"/>
+          <w:kern w:val="2"/>
+          <w:sz w:val="24"/>
+          <w:szCs w:val="24"/>
           <w:lang w:val="es-ES" w:eastAsia="es-ES"/>
+          <w14:ligatures w14:val="standardContextual"/>
         </w:rPr>
       </w:pPr>
       <w:r>
@@ -956,9 +960,11 @@
         <w:rPr>
           <w:rFonts w:asciiTheme="minorHAnsi" w:eastAsiaTheme="minorEastAsia" w:hAnsiTheme="minorHAnsi" w:cstheme="minorBidi"/>
           <w:noProof/>
-          <w:sz w:val="22"/>
-          <w:szCs w:val="22"/>
+          <w:kern w:val="2"/>
+          <w:sz w:val="24"/>
+          <w:szCs w:val="24"/>
           <w:lang w:val="es-ES" w:eastAsia="es-ES"/>
+          <w14:ligatures w14:val="standardContextual"/>
         </w:rPr>
         <w:tab/>
       </w:r>
@@ -972,7 +978,6 @@
       <w:r>
         <w:rPr>
           <w:noProof/>
-          <w:lang w:val="es-ES"/>
         </w:rPr>
         <w:tab/>
       </w:r>
@@ -985,9 +990,8 @@
       <w:r>
         <w:rPr>
           <w:noProof/>
-          <w:lang w:val="es-ES"/>
-        </w:rPr>
-        <w:instrText xml:space="preserve"> PAGEREF _Toc278820254 \h </w:instrText>
+        </w:rPr>
+        <w:instrText xml:space="preserve"> PAGEREF _Toc216897051 \h </w:instrText>
       </w:r>
       <w:r>
         <w:rPr>
@@ -1003,9 +1007,8 @@
       <w:r>
         <w:rPr>
           <w:noProof/>
-          <w:lang w:val="es-ES"/>
-        </w:rPr>
-        <w:t>1</w:t>
+        </w:rPr>
+        <w:t>4</w:t>
       </w:r>
       <w:r>
         <w:rPr>
@@ -1018,14 +1021,16 @@
       <w:pPr>
         <w:pStyle w:val="TDC2"/>
         <w:tabs>
-          <w:tab w:val="left" w:pos="1100"/>
+          <w:tab w:val="left" w:pos="1200"/>
         </w:tabs>
         <w:rPr>
           <w:rFonts w:asciiTheme="minorHAnsi" w:eastAsiaTheme="minorEastAsia" w:hAnsiTheme="minorHAnsi" w:cstheme="minorBidi"/>
           <w:noProof/>
-          <w:sz w:val="22"/>
-          <w:szCs w:val="22"/>
+          <w:kern w:val="2"/>
+          <w:sz w:val="24"/>
+          <w:szCs w:val="24"/>
           <w:lang w:val="es-ES" w:eastAsia="es-ES"/>
+          <w14:ligatures w14:val="standardContextual"/>
         </w:rPr>
       </w:pPr>
       <w:r>
@@ -1039,9 +1044,11 @@
         <w:rPr>
           <w:rFonts w:asciiTheme="minorHAnsi" w:eastAsiaTheme="minorEastAsia" w:hAnsiTheme="minorHAnsi" w:cstheme="minorBidi"/>
           <w:noProof/>
-          <w:sz w:val="22"/>
-          <w:szCs w:val="22"/>
+          <w:kern w:val="2"/>
+          <w:sz w:val="24"/>
+          <w:szCs w:val="24"/>
           <w:lang w:val="es-ES" w:eastAsia="es-ES"/>
+          <w14:ligatures w14:val="standardContextual"/>
         </w:rPr>
         <w:tab/>
       </w:r>
@@ -1055,7 +1062,6 @@
       <w:r>
         <w:rPr>
           <w:noProof/>
-          <w:lang w:val="es-ES"/>
         </w:rPr>
         <w:tab/>
       </w:r>
@@ -1068,9 +1074,8 @@
       <w:r>
         <w:rPr>
           <w:noProof/>
-          <w:lang w:val="es-ES"/>
-        </w:rPr>
-        <w:instrText xml:space="preserve"> PAGEREF _Toc278820255 \h </w:instrText>
+        </w:rPr>
+        <w:instrText xml:space="preserve"> PAGEREF _Toc216897052 \h </w:instrText>
       </w:r>
       <w:r>
         <w:rPr>
@@ -1086,9 +1091,8 @@
       <w:r>
         <w:rPr>
           <w:noProof/>
-          <w:lang w:val="es-ES"/>
-        </w:rPr>
-        <w:t>1</w:t>
+        </w:rPr>
+        <w:t>4</w:t>
       </w:r>
       <w:r>
         <w:rPr>
@@ -1101,14 +1105,16 @@
       <w:pPr>
         <w:pStyle w:val="TDC2"/>
         <w:tabs>
-          <w:tab w:val="left" w:pos="1100"/>
+          <w:tab w:val="left" w:pos="1200"/>
         </w:tabs>
         <w:rPr>
           <w:rFonts w:asciiTheme="minorHAnsi" w:eastAsiaTheme="minorEastAsia" w:hAnsiTheme="minorHAnsi" w:cstheme="minorBidi"/>
           <w:noProof/>
-          <w:sz w:val="22"/>
-          <w:szCs w:val="22"/>
+          <w:kern w:val="2"/>
+          <w:sz w:val="24"/>
+          <w:szCs w:val="24"/>
           <w:lang w:val="es-ES" w:eastAsia="es-ES"/>
+          <w14:ligatures w14:val="standardContextual"/>
         </w:rPr>
       </w:pPr>
       <w:r>
@@ -1122,9 +1128,11 @@
         <w:rPr>
           <w:rFonts w:asciiTheme="minorHAnsi" w:eastAsiaTheme="minorEastAsia" w:hAnsiTheme="minorHAnsi" w:cstheme="minorBidi"/>
           <w:noProof/>
-          <w:sz w:val="22"/>
-          <w:szCs w:val="22"/>
+          <w:kern w:val="2"/>
+          <w:sz w:val="24"/>
+          <w:szCs w:val="24"/>
           <w:lang w:val="es-ES" w:eastAsia="es-ES"/>
+          <w14:ligatures w14:val="standardContextual"/>
         </w:rPr>
         <w:tab/>
       </w:r>
@@ -1138,7 +1146,6 @@
       <w:r>
         <w:rPr>
           <w:noProof/>
-          <w:lang w:val="es-ES"/>
         </w:rPr>
         <w:tab/>
       </w:r>
@@ -1151,9 +1158,8 @@
       <w:r>
         <w:rPr>
           <w:noProof/>
-          <w:lang w:val="es-ES"/>
-        </w:rPr>
-        <w:instrText xml:space="preserve"> PAGEREF _Toc278820256 \h </w:instrText>
+        </w:rPr>
+        <w:instrText xml:space="preserve"> PAGEREF _Toc216897053 \h </w:instrText>
       </w:r>
       <w:r>
         <w:rPr>
@@ -1169,9 +1175,8 @@
       <w:r>
         <w:rPr>
           <w:noProof/>
-          <w:lang w:val="es-ES"/>
-        </w:rPr>
-        <w:t>1</w:t>
+        </w:rPr>
+        <w:t>4</w:t>
       </w:r>
       <w:r>
         <w:rPr>
@@ -1184,14 +1189,16 @@
       <w:pPr>
         <w:pStyle w:val="TDC2"/>
         <w:tabs>
-          <w:tab w:val="left" w:pos="1100"/>
+          <w:tab w:val="left" w:pos="1200"/>
         </w:tabs>
         <w:rPr>
           <w:rFonts w:asciiTheme="minorHAnsi" w:eastAsiaTheme="minorEastAsia" w:hAnsiTheme="minorHAnsi" w:cstheme="minorBidi"/>
           <w:noProof/>
-          <w:sz w:val="22"/>
-          <w:szCs w:val="22"/>
+          <w:kern w:val="2"/>
+          <w:sz w:val="24"/>
+          <w:szCs w:val="24"/>
           <w:lang w:val="es-ES" w:eastAsia="es-ES"/>
+          <w14:ligatures w14:val="standardContextual"/>
         </w:rPr>
       </w:pPr>
       <w:r>
@@ -1205,9 +1212,11 @@
         <w:rPr>
           <w:rFonts w:asciiTheme="minorHAnsi" w:eastAsiaTheme="minorEastAsia" w:hAnsiTheme="minorHAnsi" w:cstheme="minorBidi"/>
           <w:noProof/>
-          <w:sz w:val="22"/>
-          <w:szCs w:val="22"/>
+          <w:kern w:val="2"/>
+          <w:sz w:val="24"/>
+          <w:szCs w:val="24"/>
           <w:lang w:val="es-ES" w:eastAsia="es-ES"/>
+          <w14:ligatures w14:val="standardContextual"/>
         </w:rPr>
         <w:tab/>
       </w:r>
@@ -1221,7 +1230,6 @@
       <w:r>
         <w:rPr>
           <w:noProof/>
-          <w:lang w:val="es-ES"/>
         </w:rPr>
         <w:tab/>
       </w:r>
@@ -1234,9 +1242,8 @@
       <w:r>
         <w:rPr>
           <w:noProof/>
-          <w:lang w:val="es-ES"/>
-        </w:rPr>
-        <w:instrText xml:space="preserve"> PAGEREF _Toc278820257 \h </w:instrText>
+        </w:rPr>
+        <w:instrText xml:space="preserve"> PAGEREF _Toc216897054 \h </w:instrText>
       </w:r>
       <w:r>
         <w:rPr>
@@ -1252,9 +1259,8 @@
       <w:r>
         <w:rPr>
           <w:noProof/>
-          <w:lang w:val="es-ES"/>
-        </w:rPr>
-        <w:t>1</w:t>
+        </w:rPr>
+        <w:t>4</w:t>
       </w:r>
       <w:r>
         <w:rPr>
@@ -1267,14 +1273,16 @@
       <w:pPr>
         <w:pStyle w:val="TDC1"/>
         <w:tabs>
-          <w:tab w:val="left" w:pos="432"/>
+          <w:tab w:val="left" w:pos="864"/>
         </w:tabs>
         <w:rPr>
           <w:rFonts w:asciiTheme="minorHAnsi" w:eastAsiaTheme="minorEastAsia" w:hAnsiTheme="minorHAnsi" w:cstheme="minorBidi"/>
           <w:noProof/>
-          <w:sz w:val="22"/>
-          <w:szCs w:val="22"/>
+          <w:kern w:val="2"/>
+          <w:sz w:val="24"/>
+          <w:szCs w:val="24"/>
           <w:lang w:val="es-ES" w:eastAsia="es-ES"/>
+          <w14:ligatures w14:val="standardContextual"/>
         </w:rPr>
       </w:pPr>
       <w:r>
@@ -1288,9 +1296,11 @@
         <w:rPr>
           <w:rFonts w:asciiTheme="minorHAnsi" w:eastAsiaTheme="minorEastAsia" w:hAnsiTheme="minorHAnsi" w:cstheme="minorBidi"/>
           <w:noProof/>
-          <w:sz w:val="22"/>
-          <w:szCs w:val="22"/>
+          <w:kern w:val="2"/>
+          <w:sz w:val="24"/>
+          <w:szCs w:val="24"/>
           <w:lang w:val="es-ES" w:eastAsia="es-ES"/>
+          <w14:ligatures w14:val="standardContextual"/>
         </w:rPr>
         <w:tab/>
       </w:r>
@@ -1304,7 +1314,6 @@
       <w:r>
         <w:rPr>
           <w:noProof/>
-          <w:lang w:val="es-ES"/>
         </w:rPr>
         <w:tab/>
       </w:r>
@@ -1317,9 +1326,8 @@
       <w:r>
         <w:rPr>
           <w:noProof/>
-          <w:lang w:val="es-ES"/>
-        </w:rPr>
-        <w:instrText xml:space="preserve"> PAGEREF _Toc278820258 \h </w:instrText>
+        </w:rPr>
+        <w:instrText xml:space="preserve"> PAGEREF _Toc216897055 \h </w:instrText>
       </w:r>
       <w:r>
         <w:rPr>
@@ -1335,9 +1343,8 @@
       <w:r>
         <w:rPr>
           <w:noProof/>
-          <w:lang w:val="es-ES"/>
-        </w:rPr>
-        <w:t>1</w:t>
+        </w:rPr>
+        <w:t>4</w:t>
       </w:r>
       <w:r>
         <w:rPr>
@@ -1350,14 +1357,16 @@
       <w:pPr>
         <w:pStyle w:val="TDC1"/>
         <w:tabs>
-          <w:tab w:val="left" w:pos="432"/>
+          <w:tab w:val="left" w:pos="864"/>
         </w:tabs>
         <w:rPr>
           <w:rFonts w:asciiTheme="minorHAnsi" w:eastAsiaTheme="minorEastAsia" w:hAnsiTheme="minorHAnsi" w:cstheme="minorBidi"/>
           <w:noProof/>
-          <w:sz w:val="22"/>
-          <w:szCs w:val="22"/>
+          <w:kern w:val="2"/>
+          <w:sz w:val="24"/>
+          <w:szCs w:val="24"/>
           <w:lang w:val="es-ES" w:eastAsia="es-ES"/>
+          <w14:ligatures w14:val="standardContextual"/>
         </w:rPr>
       </w:pPr>
       <w:r>
@@ -1371,9 +1380,11 @@
         <w:rPr>
           <w:rFonts w:asciiTheme="minorHAnsi" w:eastAsiaTheme="minorEastAsia" w:hAnsiTheme="minorHAnsi" w:cstheme="minorBidi"/>
           <w:noProof/>
-          <w:sz w:val="22"/>
-          <w:szCs w:val="22"/>
+          <w:kern w:val="2"/>
+          <w:sz w:val="24"/>
+          <w:szCs w:val="24"/>
           <w:lang w:val="es-ES" w:eastAsia="es-ES"/>
+          <w14:ligatures w14:val="standardContextual"/>
         </w:rPr>
         <w:tab/>
       </w:r>
@@ -1387,7 +1398,6 @@
       <w:r>
         <w:rPr>
           <w:noProof/>
-          <w:lang w:val="es-ES"/>
         </w:rPr>
         <w:tab/>
       </w:r>
@@ -1400,9 +1410,8 @@
       <w:r>
         <w:rPr>
           <w:noProof/>
-          <w:lang w:val="es-ES"/>
-        </w:rPr>
-        <w:instrText xml:space="preserve"> PAGEREF _Toc278820259 \h </w:instrText>
+        </w:rPr>
+        <w:instrText xml:space="preserve"> PAGEREF _Toc216897056 \h </w:instrText>
       </w:r>
       <w:r>
         <w:rPr>
@@ -1418,9 +1427,8 @@
       <w:r>
         <w:rPr>
           <w:noProof/>
-          <w:lang w:val="es-ES"/>
-        </w:rPr>
-        <w:t>1</w:t>
+        </w:rPr>
+        <w:t>4</w:t>
       </w:r>
       <w:r>
         <w:rPr>
@@ -1492,16 +1500,16 @@
           <w:lang w:val="es-ES"/>
         </w:rPr>
       </w:pPr>
-      <w:bookmarkStart w:id="0" w:name="_Toc278820252"/>
-      <w:bookmarkStart w:id="1" w:name="_Toc436203377"/>
-      <w:bookmarkStart w:id="2" w:name="_Toc452813577"/>
+      <w:bookmarkStart w:id="0" w:name="_Toc436203377"/>
+      <w:bookmarkStart w:id="1" w:name="_Toc452813577"/>
+      <w:bookmarkStart w:id="2" w:name="_Toc216897049"/>
       <w:r>
         <w:rPr>
           <w:lang w:val="es-ES"/>
         </w:rPr>
         <w:t>Elementos de prueba</w:t>
       </w:r>
-      <w:bookmarkEnd w:id="0"/>
+      <w:bookmarkEnd w:id="2"/>
     </w:p>
     <w:p>
       <w:pPr>
@@ -1530,7 +1538,7 @@
           <w:lang w:val="es-ES"/>
         </w:rPr>
       </w:pPr>
-      <w:bookmarkStart w:id="3" w:name="_Toc278820253"/>
+      <w:bookmarkStart w:id="3" w:name="_Toc216897050"/>
       <w:r>
         <w:rPr>
           <w:lang w:val="es-ES"/>
@@ -1560,6 +1568,7 @@
                 <w:lang w:val="es-ES"/>
               </w:rPr>
             </w:pPr>
+            <w:bookmarkStart w:id="4" w:name="_Hlk216896508"/>
             <w:r>
               <w:rPr>
                 <w:lang w:val="es-ES"/>
@@ -1915,6 +1924,7 @@
           </w:p>
         </w:tc>
       </w:tr>
+      <w:bookmarkEnd w:id="4"/>
     </w:tbl>
     <w:p>
       <w:pPr>
@@ -1987,6 +1997,7 @@
                 <w:lang w:val="es-ES"/>
               </w:rPr>
             </w:pPr>
+            <w:bookmarkStart w:id="5" w:name="_Hlk216896530"/>
             <w:r>
               <w:rPr>
                 <w:lang w:val="es-ES"/>
@@ -2425,19 +2436,11 @@
               </w:rPr>
               <w:t xml:space="preserve"> Cervantes,8”</w:t>
             </w:r>
-            <w:proofErr w:type="gramStart"/>
-            <w:r>
-              <w:rPr>
-                <w:lang w:val="es-ES"/>
-              </w:rPr>
-              <w:t>,”Visa</w:t>
-            </w:r>
-            <w:proofErr w:type="gramEnd"/>
-            <w:r>
-              <w:rPr>
-                <w:lang w:val="es-ES"/>
-              </w:rPr>
-              <w:t>”,</w:t>
+            <w:r>
+              <w:rPr>
+                <w:lang w:val="es-ES"/>
+              </w:rPr>
+              <w:t>,”Visa”,</w:t>
             </w:r>
             <w:r>
               <w:rPr>
@@ -2528,13 +2531,7 @@
               <w:rPr>
                 <w:lang w:val="es-ES"/>
               </w:rPr>
-              <w:t>UC2_</w:t>
-            </w:r>
-            <w:r>
-              <w:rPr>
-                <w:lang w:val="es-ES"/>
-              </w:rPr>
-              <w:t>2</w:t>
+              <w:t>UC2_2</w:t>
             </w:r>
           </w:p>
         </w:tc>
@@ -2757,27 +2754,7 @@
                 <w:lang w:val="es-ES"/>
               </w:rPr>
               <w:lastRenderedPageBreak/>
-              <w:t>“Calle Cervantes,8”</w:t>
-            </w:r>
-            <w:proofErr w:type="gramStart"/>
-            <w:r>
-              <w:rPr>
-                <w:lang w:val="es-ES"/>
-              </w:rPr>
-              <w:t>,</w:t>
-            </w:r>
-            <w:r>
-              <w:rPr>
-                <w:lang w:val="es-ES"/>
-              </w:rPr>
-              <w:t>”GooglePay</w:t>
-            </w:r>
-            <w:proofErr w:type="gramEnd"/>
-            <w:r>
-              <w:rPr>
-                <w:lang w:val="es-ES"/>
-              </w:rPr>
-              <w:t>”,</w:t>
+              <w:t>“Calle Cervantes,8”,”GooglePay”,</w:t>
             </w:r>
             <w:r>
               <w:rPr>
@@ -2869,13 +2846,7 @@
                 <w:lang w:val="es-ES"/>
               </w:rPr>
               <w:lastRenderedPageBreak/>
-              <w:t>UC2_</w:t>
-            </w:r>
-            <w:r>
-              <w:rPr>
-                <w:lang w:val="es-ES"/>
-              </w:rPr>
-              <w:t>3</w:t>
+              <w:t>UC2_3</w:t>
             </w:r>
           </w:p>
         </w:tc>
@@ -2893,13 +2864,7 @@
               <w:rPr>
                 <w:lang w:val="es-ES"/>
               </w:rPr>
-              <w:t xml:space="preserve">Esc-1/escenario correcto con </w:t>
-            </w:r>
-            <w:r>
-              <w:rPr>
-                <w:lang w:val="es-ES"/>
-              </w:rPr>
-              <w:t>PayPal</w:t>
+              <w:t>Esc-1/escenario correcto con PayPal</w:t>
             </w:r>
           </w:p>
         </w:tc>
@@ -3045,25 +3010,7 @@
               <w:rPr>
                 <w:lang w:val="es-ES"/>
               </w:rPr>
-              <w:t>“Pablo Ballestero”, “Calle Cervantes,8”,</w:t>
-            </w:r>
-            <w:r>
-              <w:rPr>
-                <w:lang w:val="es-ES"/>
-              </w:rPr>
-              <w:t xml:space="preserve">” </w:t>
-            </w:r>
-            <w:r>
-              <w:rPr>
-                <w:lang w:val="es-ES"/>
-              </w:rPr>
-              <w:t>PayPal</w:t>
-            </w:r>
-            <w:r>
-              <w:rPr>
-                <w:lang w:val="es-ES"/>
-              </w:rPr>
-              <w:t>”</w:t>
+              <w:t>“Pablo Ballestero”, “Calle Cervantes,8”,” PayPal”</w:t>
             </w:r>
             <w:r>
               <w:rPr>
@@ -3198,6 +3145,12 @@
                 <w:lang w:val="es-ES"/>
               </w:rPr>
             </w:pPr>
+            <w:r>
+              <w:rPr>
+                <w:lang w:val="es-ES"/>
+              </w:rPr>
+              <w:t>1</w:t>
+            </w:r>
           </w:p>
         </w:tc>
         <w:tc>
@@ -3210,6 +3163,12 @@
                 <w:lang w:val="es-ES"/>
               </w:rPr>
             </w:pPr>
+            <w:r>
+              <w:rPr>
+                <w:lang w:val="es-ES"/>
+              </w:rPr>
+              <w:t>Sedan</w:t>
+            </w:r>
           </w:p>
         </w:tc>
         <w:tc>
@@ -3349,7 +3308,21 @@
               <w:rPr>
                 <w:lang w:val="es-ES"/>
               </w:rPr>
-              <w:t xml:space="preserve"> being </w:t>
+              <w:t xml:space="preserve"> </w:t>
+            </w:r>
+            <w:proofErr w:type="spellStart"/>
+            <w:r>
+              <w:rPr>
+                <w:lang w:val="es-ES"/>
+              </w:rPr>
+              <w:t>being</w:t>
+            </w:r>
+            <w:proofErr w:type="spellEnd"/>
+            <w:r>
+              <w:rPr>
+                <w:lang w:val="es-ES"/>
+              </w:rPr>
+              <w:t xml:space="preserve"> </w:t>
             </w:r>
             <w:proofErr w:type="spellStart"/>
             <w:r>
@@ -3901,13 +3874,7 @@
               <w:rPr>
                 <w:lang w:val="es-ES"/>
               </w:rPr>
-              <w:t>Today+</w:t>
-            </w:r>
-            <w:r>
-              <w:rPr>
-                <w:lang w:val="es-ES"/>
-              </w:rPr>
-              <w:t>3</w:t>
+              <w:t>Today+3</w:t>
             </w:r>
           </w:p>
         </w:tc>
@@ -3920,13 +3887,7 @@
               <w:rPr>
                 <w:lang w:val="es-ES"/>
               </w:rPr>
-              <w:t>Today+</w:t>
-            </w:r>
-            <w:r>
-              <w:rPr>
-                <w:lang w:val="es-ES"/>
-              </w:rPr>
-              <w:t>4</w:t>
+              <w:t>Today+4</w:t>
             </w:r>
           </w:p>
         </w:tc>
@@ -4071,13 +4032,7 @@
               <w:rPr>
                 <w:lang w:val="es-ES"/>
               </w:rPr>
-              <w:t>“T</w:t>
-            </w:r>
-            <w:r>
-              <w:rPr>
-                <w:lang w:val="es-ES"/>
-              </w:rPr>
-              <w:t xml:space="preserve"> </w:t>
+              <w:t>“</w:t>
             </w:r>
             <w:r>
               <w:rPr>
@@ -5169,6 +5124,7 @@
           </w:p>
         </w:tc>
       </w:tr>
+      <w:bookmarkEnd w:id="5"/>
     </w:tbl>
     <w:p/>
     <w:p>
@@ -5178,7 +5134,7 @@
           <w:lang w:val="es-ES"/>
         </w:rPr>
       </w:pPr>
-      <w:bookmarkStart w:id="4" w:name="_Toc278820254"/>
+      <w:bookmarkStart w:id="6" w:name="_Toc216897051"/>
       <w:r>
         <w:rPr>
           <w:lang w:val="es-ES"/>
@@ -5186,7 +5142,7 @@
         <w:lastRenderedPageBreak/>
         <w:t>Necesidades ambientales</w:t>
       </w:r>
-      <w:bookmarkEnd w:id="4"/>
+      <w:bookmarkEnd w:id="6"/>
     </w:p>
     <w:p>
       <w:pPr>
@@ -5195,14 +5151,14 @@
           <w:lang w:val="es-ES"/>
         </w:rPr>
       </w:pPr>
-      <w:bookmarkStart w:id="5" w:name="_Toc278820255"/>
+      <w:bookmarkStart w:id="7" w:name="_Toc216897052"/>
       <w:r>
         <w:rPr>
           <w:lang w:val="es-ES"/>
         </w:rPr>
         <w:t>Hardware</w:t>
       </w:r>
-      <w:bookmarkEnd w:id="5"/>
+      <w:bookmarkEnd w:id="7"/>
     </w:p>
     <w:p>
       <w:pPr>
@@ -5228,21 +5184,7 @@
           <w:spacing w:val="-1"/>
           <w:w w:val="95"/>
         </w:rPr>
-        <w:t xml:space="preserve"> i</w:t>
-      </w:r>
-      <w:r>
-        <w:rPr>
-          <w:spacing w:val="-1"/>
-          <w:w w:val="95"/>
-        </w:rPr>
-        <w:t>5</w:t>
-      </w:r>
-      <w:r>
-        <w:rPr>
-          <w:spacing w:val="-1"/>
-          <w:w w:val="95"/>
-        </w:rPr>
-        <w:t>, RAM 32GB</w:t>
+        <w:t xml:space="preserve"> i5, RAM 32GB</w:t>
       </w:r>
     </w:p>
     <w:p>
@@ -5252,14 +5194,14 @@
           <w:lang w:val="es-ES"/>
         </w:rPr>
       </w:pPr>
-      <w:bookmarkStart w:id="6" w:name="_Toc278820256"/>
+      <w:bookmarkStart w:id="8" w:name="_Toc216897053"/>
       <w:r>
         <w:rPr>
           <w:lang w:val="es-ES"/>
         </w:rPr>
         <w:t>Software</w:t>
       </w:r>
-      <w:bookmarkEnd w:id="6"/>
+      <w:bookmarkEnd w:id="8"/>
     </w:p>
     <w:p>
       <w:pPr>
@@ -5298,14 +5240,14 @@
           <w:lang w:val="es-ES"/>
         </w:rPr>
       </w:pPr>
-      <w:bookmarkStart w:id="7" w:name="_Toc278820257"/>
+      <w:bookmarkStart w:id="9" w:name="_Toc216897054"/>
       <w:r>
         <w:rPr>
           <w:lang w:val="es-ES"/>
         </w:rPr>
         <w:t>Otros</w:t>
       </w:r>
-      <w:bookmarkEnd w:id="7"/>
+      <w:bookmarkEnd w:id="9"/>
     </w:p>
     <w:p>
       <w:pPr>
@@ -5336,14 +5278,14 @@
           <w:lang w:val="es-ES"/>
         </w:rPr>
       </w:pPr>
-      <w:bookmarkStart w:id="8" w:name="_Toc278820258"/>
+      <w:bookmarkStart w:id="10" w:name="_Toc216897055"/>
       <w:r>
         <w:rPr>
           <w:lang w:val="es-ES"/>
         </w:rPr>
         <w:t>Requisitos procedurales especiales</w:t>
       </w:r>
-      <w:bookmarkEnd w:id="8"/>
+      <w:bookmarkEnd w:id="10"/>
     </w:p>
     <w:p>
       <w:pPr>
@@ -5432,7 +5374,7 @@
           <w:lang w:val="es-ES"/>
         </w:rPr>
       </w:pPr>
-      <w:bookmarkStart w:id="9" w:name="_Toc278820259"/>
+      <w:bookmarkStart w:id="11" w:name="_Toc216897056"/>
       <w:r>
         <w:rPr>
           <w:lang w:val="es-ES"/>
@@ -5457,10 +5399,10 @@
         </w:rPr>
         <w:t xml:space="preserve"> de Prueba</w:t>
       </w:r>
-      <w:bookmarkEnd w:id="9"/>
+      <w:bookmarkEnd w:id="11"/>
     </w:p>
+    <w:bookmarkEnd w:id="0"/>
     <w:bookmarkEnd w:id="1"/>
-    <w:bookmarkEnd w:id="2"/>
     <w:p>
       <w:pPr>
         <w:ind w:left="708"/>
@@ -6893,6 +6835,7 @@
   <w:style w:type="character" w:default="1" w:styleId="Fuentedeprrafopredeter">
     <w:name w:val="Default Paragraph Font"/>
     <w:uiPriority w:val="1"/>
+    <w:semiHidden/>
     <w:unhideWhenUsed/>
   </w:style>
   <w:style w:type="table" w:default="1" w:styleId="Tablanormal">

</xml_diff>

<commit_message>
Corregidos documentos de casos de prueba (#251)
</commit_message>
<xml_diff>
--- a/test/AppForSEII2526.UIT/RentalCars/Casos de Prueba_UC2.docx
+++ b/test/AppForSEII2526.UIT/RentalCars/Casos de Prueba_UC2.docx
@@ -749,14 +749,16 @@
       <w:pPr>
         <w:pStyle w:val="TDC1"/>
         <w:tabs>
-          <w:tab w:val="left" w:pos="432"/>
+          <w:tab w:val="left" w:pos="864"/>
         </w:tabs>
         <w:rPr>
           <w:rFonts w:asciiTheme="minorHAnsi" w:eastAsiaTheme="minorEastAsia" w:hAnsiTheme="minorHAnsi" w:cstheme="minorBidi"/>
           <w:noProof/>
-          <w:sz w:val="22"/>
-          <w:szCs w:val="22"/>
+          <w:kern w:val="2"/>
+          <w:sz w:val="24"/>
+          <w:szCs w:val="24"/>
           <w:lang w:val="es-ES" w:eastAsia="es-ES"/>
+          <w14:ligatures w14:val="standardContextual"/>
         </w:rPr>
       </w:pPr>
       <w:r>
@@ -790,9 +792,11 @@
         <w:rPr>
           <w:rFonts w:asciiTheme="minorHAnsi" w:eastAsiaTheme="minorEastAsia" w:hAnsiTheme="minorHAnsi" w:cstheme="minorBidi"/>
           <w:noProof/>
-          <w:sz w:val="22"/>
-          <w:szCs w:val="22"/>
+          <w:kern w:val="2"/>
+          <w:sz w:val="24"/>
+          <w:szCs w:val="24"/>
           <w:lang w:val="es-ES" w:eastAsia="es-ES"/>
+          <w14:ligatures w14:val="standardContextual"/>
         </w:rPr>
         <w:tab/>
       </w:r>
@@ -806,7 +810,6 @@
       <w:r>
         <w:rPr>
           <w:noProof/>
-          <w:lang w:val="es-ES"/>
         </w:rPr>
         <w:tab/>
       </w:r>
@@ -819,9 +822,8 @@
       <w:r>
         <w:rPr>
           <w:noProof/>
-          <w:lang w:val="es-ES"/>
-        </w:rPr>
-        <w:instrText xml:space="preserve"> PAGEREF _Toc278820252 \h </w:instrText>
+        </w:rPr>
+        <w:instrText xml:space="preserve"> PAGEREF _Toc216897049 \h </w:instrText>
       </w:r>
       <w:r>
         <w:rPr>
@@ -837,7 +839,6 @@
       <w:r>
         <w:rPr>
           <w:noProof/>
-          <w:lang w:val="es-ES"/>
         </w:rPr>
         <w:t>1</w:t>
       </w:r>
@@ -852,14 +853,16 @@
       <w:pPr>
         <w:pStyle w:val="TDC1"/>
         <w:tabs>
-          <w:tab w:val="left" w:pos="432"/>
+          <w:tab w:val="left" w:pos="864"/>
         </w:tabs>
         <w:rPr>
           <w:rFonts w:asciiTheme="minorHAnsi" w:eastAsiaTheme="minorEastAsia" w:hAnsiTheme="minorHAnsi" w:cstheme="minorBidi"/>
           <w:noProof/>
-          <w:sz w:val="22"/>
-          <w:szCs w:val="22"/>
+          <w:kern w:val="2"/>
+          <w:sz w:val="24"/>
+          <w:szCs w:val="24"/>
           <w:lang w:val="es-ES" w:eastAsia="es-ES"/>
+          <w14:ligatures w14:val="standardContextual"/>
         </w:rPr>
       </w:pPr>
       <w:r>
@@ -873,9 +876,11 @@
         <w:rPr>
           <w:rFonts w:asciiTheme="minorHAnsi" w:eastAsiaTheme="minorEastAsia" w:hAnsiTheme="minorHAnsi" w:cstheme="minorBidi"/>
           <w:noProof/>
-          <w:sz w:val="22"/>
-          <w:szCs w:val="22"/>
+          <w:kern w:val="2"/>
+          <w:sz w:val="24"/>
+          <w:szCs w:val="24"/>
           <w:lang w:val="es-ES" w:eastAsia="es-ES"/>
+          <w14:ligatures w14:val="standardContextual"/>
         </w:rPr>
         <w:tab/>
       </w:r>
@@ -889,7 +894,6 @@
       <w:r>
         <w:rPr>
           <w:noProof/>
-          <w:lang w:val="es-ES"/>
         </w:rPr>
         <w:tab/>
       </w:r>
@@ -902,9 +906,8 @@
       <w:r>
         <w:rPr>
           <w:noProof/>
-          <w:lang w:val="es-ES"/>
-        </w:rPr>
-        <w:instrText xml:space="preserve"> PAGEREF _Toc278820253 \h </w:instrText>
+        </w:rPr>
+        <w:instrText xml:space="preserve"> PAGEREF _Toc216897050 \h </w:instrText>
       </w:r>
       <w:r>
         <w:rPr>
@@ -920,7 +923,6 @@
       <w:r>
         <w:rPr>
           <w:noProof/>
-          <w:lang w:val="es-ES"/>
         </w:rPr>
         <w:t>1</w:t>
       </w:r>
@@ -935,14 +937,16 @@
       <w:pPr>
         <w:pStyle w:val="TDC1"/>
         <w:tabs>
-          <w:tab w:val="left" w:pos="432"/>
+          <w:tab w:val="left" w:pos="864"/>
         </w:tabs>
         <w:rPr>
           <w:rFonts w:asciiTheme="minorHAnsi" w:eastAsiaTheme="minorEastAsia" w:hAnsiTheme="minorHAnsi" w:cstheme="minorBidi"/>
           <w:noProof/>
-          <w:sz w:val="22"/>
-          <w:szCs w:val="22"/>
+          <w:kern w:val="2"/>
+          <w:sz w:val="24"/>
+          <w:szCs w:val="24"/>
           <w:lang w:val="es-ES" w:eastAsia="es-ES"/>
+          <w14:ligatures w14:val="standardContextual"/>
         </w:rPr>
       </w:pPr>
       <w:r>
@@ -956,9 +960,11 @@
         <w:rPr>
           <w:rFonts w:asciiTheme="minorHAnsi" w:eastAsiaTheme="minorEastAsia" w:hAnsiTheme="minorHAnsi" w:cstheme="minorBidi"/>
           <w:noProof/>
-          <w:sz w:val="22"/>
-          <w:szCs w:val="22"/>
+          <w:kern w:val="2"/>
+          <w:sz w:val="24"/>
+          <w:szCs w:val="24"/>
           <w:lang w:val="es-ES" w:eastAsia="es-ES"/>
+          <w14:ligatures w14:val="standardContextual"/>
         </w:rPr>
         <w:tab/>
       </w:r>
@@ -972,7 +978,6 @@
       <w:r>
         <w:rPr>
           <w:noProof/>
-          <w:lang w:val="es-ES"/>
         </w:rPr>
         <w:tab/>
       </w:r>
@@ -985,9 +990,8 @@
       <w:r>
         <w:rPr>
           <w:noProof/>
-          <w:lang w:val="es-ES"/>
-        </w:rPr>
-        <w:instrText xml:space="preserve"> PAGEREF _Toc278820254 \h </w:instrText>
+        </w:rPr>
+        <w:instrText xml:space="preserve"> PAGEREF _Toc216897051 \h </w:instrText>
       </w:r>
       <w:r>
         <w:rPr>
@@ -1003,9 +1007,8 @@
       <w:r>
         <w:rPr>
           <w:noProof/>
-          <w:lang w:val="es-ES"/>
-        </w:rPr>
-        <w:t>1</w:t>
+        </w:rPr>
+        <w:t>4</w:t>
       </w:r>
       <w:r>
         <w:rPr>
@@ -1018,14 +1021,16 @@
       <w:pPr>
         <w:pStyle w:val="TDC2"/>
         <w:tabs>
-          <w:tab w:val="left" w:pos="1100"/>
+          <w:tab w:val="left" w:pos="1200"/>
         </w:tabs>
         <w:rPr>
           <w:rFonts w:asciiTheme="minorHAnsi" w:eastAsiaTheme="minorEastAsia" w:hAnsiTheme="minorHAnsi" w:cstheme="minorBidi"/>
           <w:noProof/>
-          <w:sz w:val="22"/>
-          <w:szCs w:val="22"/>
+          <w:kern w:val="2"/>
+          <w:sz w:val="24"/>
+          <w:szCs w:val="24"/>
           <w:lang w:val="es-ES" w:eastAsia="es-ES"/>
+          <w14:ligatures w14:val="standardContextual"/>
         </w:rPr>
       </w:pPr>
       <w:r>
@@ -1039,9 +1044,11 @@
         <w:rPr>
           <w:rFonts w:asciiTheme="minorHAnsi" w:eastAsiaTheme="minorEastAsia" w:hAnsiTheme="minorHAnsi" w:cstheme="minorBidi"/>
           <w:noProof/>
-          <w:sz w:val="22"/>
-          <w:szCs w:val="22"/>
+          <w:kern w:val="2"/>
+          <w:sz w:val="24"/>
+          <w:szCs w:val="24"/>
           <w:lang w:val="es-ES" w:eastAsia="es-ES"/>
+          <w14:ligatures w14:val="standardContextual"/>
         </w:rPr>
         <w:tab/>
       </w:r>
@@ -1055,7 +1062,6 @@
       <w:r>
         <w:rPr>
           <w:noProof/>
-          <w:lang w:val="es-ES"/>
         </w:rPr>
         <w:tab/>
       </w:r>
@@ -1068,9 +1074,8 @@
       <w:r>
         <w:rPr>
           <w:noProof/>
-          <w:lang w:val="es-ES"/>
-        </w:rPr>
-        <w:instrText xml:space="preserve"> PAGEREF _Toc278820255 \h </w:instrText>
+        </w:rPr>
+        <w:instrText xml:space="preserve"> PAGEREF _Toc216897052 \h </w:instrText>
       </w:r>
       <w:r>
         <w:rPr>
@@ -1086,9 +1091,8 @@
       <w:r>
         <w:rPr>
           <w:noProof/>
-          <w:lang w:val="es-ES"/>
-        </w:rPr>
-        <w:t>1</w:t>
+        </w:rPr>
+        <w:t>4</w:t>
       </w:r>
       <w:r>
         <w:rPr>
@@ -1101,14 +1105,16 @@
       <w:pPr>
         <w:pStyle w:val="TDC2"/>
         <w:tabs>
-          <w:tab w:val="left" w:pos="1100"/>
+          <w:tab w:val="left" w:pos="1200"/>
         </w:tabs>
         <w:rPr>
           <w:rFonts w:asciiTheme="minorHAnsi" w:eastAsiaTheme="minorEastAsia" w:hAnsiTheme="minorHAnsi" w:cstheme="minorBidi"/>
           <w:noProof/>
-          <w:sz w:val="22"/>
-          <w:szCs w:val="22"/>
+          <w:kern w:val="2"/>
+          <w:sz w:val="24"/>
+          <w:szCs w:val="24"/>
           <w:lang w:val="es-ES" w:eastAsia="es-ES"/>
+          <w14:ligatures w14:val="standardContextual"/>
         </w:rPr>
       </w:pPr>
       <w:r>
@@ -1122,9 +1128,11 @@
         <w:rPr>
           <w:rFonts w:asciiTheme="minorHAnsi" w:eastAsiaTheme="minorEastAsia" w:hAnsiTheme="minorHAnsi" w:cstheme="minorBidi"/>
           <w:noProof/>
-          <w:sz w:val="22"/>
-          <w:szCs w:val="22"/>
+          <w:kern w:val="2"/>
+          <w:sz w:val="24"/>
+          <w:szCs w:val="24"/>
           <w:lang w:val="es-ES" w:eastAsia="es-ES"/>
+          <w14:ligatures w14:val="standardContextual"/>
         </w:rPr>
         <w:tab/>
       </w:r>
@@ -1138,7 +1146,6 @@
       <w:r>
         <w:rPr>
           <w:noProof/>
-          <w:lang w:val="es-ES"/>
         </w:rPr>
         <w:tab/>
       </w:r>
@@ -1151,9 +1158,8 @@
       <w:r>
         <w:rPr>
           <w:noProof/>
-          <w:lang w:val="es-ES"/>
-        </w:rPr>
-        <w:instrText xml:space="preserve"> PAGEREF _Toc278820256 \h </w:instrText>
+        </w:rPr>
+        <w:instrText xml:space="preserve"> PAGEREF _Toc216897053 \h </w:instrText>
       </w:r>
       <w:r>
         <w:rPr>
@@ -1169,9 +1175,8 @@
       <w:r>
         <w:rPr>
           <w:noProof/>
-          <w:lang w:val="es-ES"/>
-        </w:rPr>
-        <w:t>1</w:t>
+        </w:rPr>
+        <w:t>4</w:t>
       </w:r>
       <w:r>
         <w:rPr>
@@ -1184,14 +1189,16 @@
       <w:pPr>
         <w:pStyle w:val="TDC2"/>
         <w:tabs>
-          <w:tab w:val="left" w:pos="1100"/>
+          <w:tab w:val="left" w:pos="1200"/>
         </w:tabs>
         <w:rPr>
           <w:rFonts w:asciiTheme="minorHAnsi" w:eastAsiaTheme="minorEastAsia" w:hAnsiTheme="minorHAnsi" w:cstheme="minorBidi"/>
           <w:noProof/>
-          <w:sz w:val="22"/>
-          <w:szCs w:val="22"/>
+          <w:kern w:val="2"/>
+          <w:sz w:val="24"/>
+          <w:szCs w:val="24"/>
           <w:lang w:val="es-ES" w:eastAsia="es-ES"/>
+          <w14:ligatures w14:val="standardContextual"/>
         </w:rPr>
       </w:pPr>
       <w:r>
@@ -1205,9 +1212,11 @@
         <w:rPr>
           <w:rFonts w:asciiTheme="minorHAnsi" w:eastAsiaTheme="minorEastAsia" w:hAnsiTheme="minorHAnsi" w:cstheme="minorBidi"/>
           <w:noProof/>
-          <w:sz w:val="22"/>
-          <w:szCs w:val="22"/>
+          <w:kern w:val="2"/>
+          <w:sz w:val="24"/>
+          <w:szCs w:val="24"/>
           <w:lang w:val="es-ES" w:eastAsia="es-ES"/>
+          <w14:ligatures w14:val="standardContextual"/>
         </w:rPr>
         <w:tab/>
       </w:r>
@@ -1221,7 +1230,6 @@
       <w:r>
         <w:rPr>
           <w:noProof/>
-          <w:lang w:val="es-ES"/>
         </w:rPr>
         <w:tab/>
       </w:r>
@@ -1234,9 +1242,8 @@
       <w:r>
         <w:rPr>
           <w:noProof/>
-          <w:lang w:val="es-ES"/>
-        </w:rPr>
-        <w:instrText xml:space="preserve"> PAGEREF _Toc278820257 \h </w:instrText>
+        </w:rPr>
+        <w:instrText xml:space="preserve"> PAGEREF _Toc216897054 \h </w:instrText>
       </w:r>
       <w:r>
         <w:rPr>
@@ -1252,9 +1259,8 @@
       <w:r>
         <w:rPr>
           <w:noProof/>
-          <w:lang w:val="es-ES"/>
-        </w:rPr>
-        <w:t>1</w:t>
+        </w:rPr>
+        <w:t>4</w:t>
       </w:r>
       <w:r>
         <w:rPr>
@@ -1267,14 +1273,16 @@
       <w:pPr>
         <w:pStyle w:val="TDC1"/>
         <w:tabs>
-          <w:tab w:val="left" w:pos="432"/>
+          <w:tab w:val="left" w:pos="864"/>
         </w:tabs>
         <w:rPr>
           <w:rFonts w:asciiTheme="minorHAnsi" w:eastAsiaTheme="minorEastAsia" w:hAnsiTheme="minorHAnsi" w:cstheme="minorBidi"/>
           <w:noProof/>
-          <w:sz w:val="22"/>
-          <w:szCs w:val="22"/>
+          <w:kern w:val="2"/>
+          <w:sz w:val="24"/>
+          <w:szCs w:val="24"/>
           <w:lang w:val="es-ES" w:eastAsia="es-ES"/>
+          <w14:ligatures w14:val="standardContextual"/>
         </w:rPr>
       </w:pPr>
       <w:r>
@@ -1288,9 +1296,11 @@
         <w:rPr>
           <w:rFonts w:asciiTheme="minorHAnsi" w:eastAsiaTheme="minorEastAsia" w:hAnsiTheme="minorHAnsi" w:cstheme="minorBidi"/>
           <w:noProof/>
-          <w:sz w:val="22"/>
-          <w:szCs w:val="22"/>
+          <w:kern w:val="2"/>
+          <w:sz w:val="24"/>
+          <w:szCs w:val="24"/>
           <w:lang w:val="es-ES" w:eastAsia="es-ES"/>
+          <w14:ligatures w14:val="standardContextual"/>
         </w:rPr>
         <w:tab/>
       </w:r>
@@ -1304,7 +1314,6 @@
       <w:r>
         <w:rPr>
           <w:noProof/>
-          <w:lang w:val="es-ES"/>
         </w:rPr>
         <w:tab/>
       </w:r>
@@ -1317,9 +1326,8 @@
       <w:r>
         <w:rPr>
           <w:noProof/>
-          <w:lang w:val="es-ES"/>
-        </w:rPr>
-        <w:instrText xml:space="preserve"> PAGEREF _Toc278820258 \h </w:instrText>
+        </w:rPr>
+        <w:instrText xml:space="preserve"> PAGEREF _Toc216897055 \h </w:instrText>
       </w:r>
       <w:r>
         <w:rPr>
@@ -1335,9 +1343,8 @@
       <w:r>
         <w:rPr>
           <w:noProof/>
-          <w:lang w:val="es-ES"/>
-        </w:rPr>
-        <w:t>1</w:t>
+        </w:rPr>
+        <w:t>4</w:t>
       </w:r>
       <w:r>
         <w:rPr>
@@ -1350,14 +1357,16 @@
       <w:pPr>
         <w:pStyle w:val="TDC1"/>
         <w:tabs>
-          <w:tab w:val="left" w:pos="432"/>
+          <w:tab w:val="left" w:pos="864"/>
         </w:tabs>
         <w:rPr>
           <w:rFonts w:asciiTheme="minorHAnsi" w:eastAsiaTheme="minorEastAsia" w:hAnsiTheme="minorHAnsi" w:cstheme="minorBidi"/>
           <w:noProof/>
-          <w:sz w:val="22"/>
-          <w:szCs w:val="22"/>
+          <w:kern w:val="2"/>
+          <w:sz w:val="24"/>
+          <w:szCs w:val="24"/>
           <w:lang w:val="es-ES" w:eastAsia="es-ES"/>
+          <w14:ligatures w14:val="standardContextual"/>
         </w:rPr>
       </w:pPr>
       <w:r>
@@ -1371,9 +1380,11 @@
         <w:rPr>
           <w:rFonts w:asciiTheme="minorHAnsi" w:eastAsiaTheme="minorEastAsia" w:hAnsiTheme="minorHAnsi" w:cstheme="minorBidi"/>
           <w:noProof/>
-          <w:sz w:val="22"/>
-          <w:szCs w:val="22"/>
+          <w:kern w:val="2"/>
+          <w:sz w:val="24"/>
+          <w:szCs w:val="24"/>
           <w:lang w:val="es-ES" w:eastAsia="es-ES"/>
+          <w14:ligatures w14:val="standardContextual"/>
         </w:rPr>
         <w:tab/>
       </w:r>
@@ -1387,7 +1398,6 @@
       <w:r>
         <w:rPr>
           <w:noProof/>
-          <w:lang w:val="es-ES"/>
         </w:rPr>
         <w:tab/>
       </w:r>
@@ -1400,9 +1410,8 @@
       <w:r>
         <w:rPr>
           <w:noProof/>
-          <w:lang w:val="es-ES"/>
-        </w:rPr>
-        <w:instrText xml:space="preserve"> PAGEREF _Toc278820259 \h </w:instrText>
+        </w:rPr>
+        <w:instrText xml:space="preserve"> PAGEREF _Toc216897056 \h </w:instrText>
       </w:r>
       <w:r>
         <w:rPr>
@@ -1418,9 +1427,8 @@
       <w:r>
         <w:rPr>
           <w:noProof/>
-          <w:lang w:val="es-ES"/>
-        </w:rPr>
-        <w:t>1</w:t>
+        </w:rPr>
+        <w:t>4</w:t>
       </w:r>
       <w:r>
         <w:rPr>
@@ -1492,16 +1500,16 @@
           <w:lang w:val="es-ES"/>
         </w:rPr>
       </w:pPr>
-      <w:bookmarkStart w:id="0" w:name="_Toc278820252"/>
-      <w:bookmarkStart w:id="1" w:name="_Toc436203377"/>
-      <w:bookmarkStart w:id="2" w:name="_Toc452813577"/>
+      <w:bookmarkStart w:id="0" w:name="_Toc436203377"/>
+      <w:bookmarkStart w:id="1" w:name="_Toc452813577"/>
+      <w:bookmarkStart w:id="2" w:name="_Toc216897049"/>
       <w:r>
         <w:rPr>
           <w:lang w:val="es-ES"/>
         </w:rPr>
         <w:t>Elementos de prueba</w:t>
       </w:r>
-      <w:bookmarkEnd w:id="0"/>
+      <w:bookmarkEnd w:id="2"/>
     </w:p>
     <w:p>
       <w:pPr>
@@ -1530,7 +1538,7 @@
           <w:lang w:val="es-ES"/>
         </w:rPr>
       </w:pPr>
-      <w:bookmarkStart w:id="3" w:name="_Toc278820253"/>
+      <w:bookmarkStart w:id="3" w:name="_Toc216897050"/>
       <w:r>
         <w:rPr>
           <w:lang w:val="es-ES"/>
@@ -1560,6 +1568,7 @@
                 <w:lang w:val="es-ES"/>
               </w:rPr>
             </w:pPr>
+            <w:bookmarkStart w:id="4" w:name="_Hlk216896508"/>
             <w:r>
               <w:rPr>
                 <w:lang w:val="es-ES"/>
@@ -1915,6 +1924,7 @@
           </w:p>
         </w:tc>
       </w:tr>
+      <w:bookmarkEnd w:id="4"/>
     </w:tbl>
     <w:p>
       <w:pPr>
@@ -1987,6 +1997,7 @@
                 <w:lang w:val="es-ES"/>
               </w:rPr>
             </w:pPr>
+            <w:bookmarkStart w:id="5" w:name="_Hlk216896530"/>
             <w:r>
               <w:rPr>
                 <w:lang w:val="es-ES"/>
@@ -2425,19 +2436,11 @@
               </w:rPr>
               <w:t xml:space="preserve"> Cervantes,8”</w:t>
             </w:r>
-            <w:proofErr w:type="gramStart"/>
-            <w:r>
-              <w:rPr>
-                <w:lang w:val="es-ES"/>
-              </w:rPr>
-              <w:t>,”Visa</w:t>
-            </w:r>
-            <w:proofErr w:type="gramEnd"/>
-            <w:r>
-              <w:rPr>
-                <w:lang w:val="es-ES"/>
-              </w:rPr>
-              <w:t>”,</w:t>
+            <w:r>
+              <w:rPr>
+                <w:lang w:val="es-ES"/>
+              </w:rPr>
+              <w:t>,”Visa”,</w:t>
             </w:r>
             <w:r>
               <w:rPr>
@@ -2528,13 +2531,7 @@
               <w:rPr>
                 <w:lang w:val="es-ES"/>
               </w:rPr>
-              <w:t>UC2_</w:t>
-            </w:r>
-            <w:r>
-              <w:rPr>
-                <w:lang w:val="es-ES"/>
-              </w:rPr>
-              <w:t>2</w:t>
+              <w:t>UC2_2</w:t>
             </w:r>
           </w:p>
         </w:tc>
@@ -2757,27 +2754,7 @@
                 <w:lang w:val="es-ES"/>
               </w:rPr>
               <w:lastRenderedPageBreak/>
-              <w:t>“Calle Cervantes,8”</w:t>
-            </w:r>
-            <w:proofErr w:type="gramStart"/>
-            <w:r>
-              <w:rPr>
-                <w:lang w:val="es-ES"/>
-              </w:rPr>
-              <w:t>,</w:t>
-            </w:r>
-            <w:r>
-              <w:rPr>
-                <w:lang w:val="es-ES"/>
-              </w:rPr>
-              <w:t>”GooglePay</w:t>
-            </w:r>
-            <w:proofErr w:type="gramEnd"/>
-            <w:r>
-              <w:rPr>
-                <w:lang w:val="es-ES"/>
-              </w:rPr>
-              <w:t>”,</w:t>
+              <w:t>“Calle Cervantes,8”,”GooglePay”,</w:t>
             </w:r>
             <w:r>
               <w:rPr>
@@ -2869,13 +2846,7 @@
                 <w:lang w:val="es-ES"/>
               </w:rPr>
               <w:lastRenderedPageBreak/>
-              <w:t>UC2_</w:t>
-            </w:r>
-            <w:r>
-              <w:rPr>
-                <w:lang w:val="es-ES"/>
-              </w:rPr>
-              <w:t>3</w:t>
+              <w:t>UC2_3</w:t>
             </w:r>
           </w:p>
         </w:tc>
@@ -2893,13 +2864,7 @@
               <w:rPr>
                 <w:lang w:val="es-ES"/>
               </w:rPr>
-              <w:t xml:space="preserve">Esc-1/escenario correcto con </w:t>
-            </w:r>
-            <w:r>
-              <w:rPr>
-                <w:lang w:val="es-ES"/>
-              </w:rPr>
-              <w:t>PayPal</w:t>
+              <w:t>Esc-1/escenario correcto con PayPal</w:t>
             </w:r>
           </w:p>
         </w:tc>
@@ -3045,25 +3010,7 @@
               <w:rPr>
                 <w:lang w:val="es-ES"/>
               </w:rPr>
-              <w:t>“Pablo Ballestero”, “Calle Cervantes,8”,</w:t>
-            </w:r>
-            <w:r>
-              <w:rPr>
-                <w:lang w:val="es-ES"/>
-              </w:rPr>
-              <w:t xml:space="preserve">” </w:t>
-            </w:r>
-            <w:r>
-              <w:rPr>
-                <w:lang w:val="es-ES"/>
-              </w:rPr>
-              <w:t>PayPal</w:t>
-            </w:r>
-            <w:r>
-              <w:rPr>
-                <w:lang w:val="es-ES"/>
-              </w:rPr>
-              <w:t>”</w:t>
+              <w:t>“Pablo Ballestero”, “Calle Cervantes,8”,” PayPal”</w:t>
             </w:r>
             <w:r>
               <w:rPr>
@@ -3198,6 +3145,12 @@
                 <w:lang w:val="es-ES"/>
               </w:rPr>
             </w:pPr>
+            <w:r>
+              <w:rPr>
+                <w:lang w:val="es-ES"/>
+              </w:rPr>
+              <w:t>1</w:t>
+            </w:r>
           </w:p>
         </w:tc>
         <w:tc>
@@ -3210,6 +3163,12 @@
                 <w:lang w:val="es-ES"/>
               </w:rPr>
             </w:pPr>
+            <w:r>
+              <w:rPr>
+                <w:lang w:val="es-ES"/>
+              </w:rPr>
+              <w:t>Sedan</w:t>
+            </w:r>
           </w:p>
         </w:tc>
         <w:tc>
@@ -3349,7 +3308,21 @@
               <w:rPr>
                 <w:lang w:val="es-ES"/>
               </w:rPr>
-              <w:t xml:space="preserve"> being </w:t>
+              <w:t xml:space="preserve"> </w:t>
+            </w:r>
+            <w:proofErr w:type="spellStart"/>
+            <w:r>
+              <w:rPr>
+                <w:lang w:val="es-ES"/>
+              </w:rPr>
+              <w:t>being</w:t>
+            </w:r>
+            <w:proofErr w:type="spellEnd"/>
+            <w:r>
+              <w:rPr>
+                <w:lang w:val="es-ES"/>
+              </w:rPr>
+              <w:t xml:space="preserve"> </w:t>
             </w:r>
             <w:proofErr w:type="spellStart"/>
             <w:r>
@@ -3901,13 +3874,7 @@
               <w:rPr>
                 <w:lang w:val="es-ES"/>
               </w:rPr>
-              <w:t>Today+</w:t>
-            </w:r>
-            <w:r>
-              <w:rPr>
-                <w:lang w:val="es-ES"/>
-              </w:rPr>
-              <w:t>3</w:t>
+              <w:t>Today+3</w:t>
             </w:r>
           </w:p>
         </w:tc>
@@ -3920,13 +3887,7 @@
               <w:rPr>
                 <w:lang w:val="es-ES"/>
               </w:rPr>
-              <w:t>Today+</w:t>
-            </w:r>
-            <w:r>
-              <w:rPr>
-                <w:lang w:val="es-ES"/>
-              </w:rPr>
-              <w:t>4</w:t>
+              <w:t>Today+4</w:t>
             </w:r>
           </w:p>
         </w:tc>
@@ -4071,13 +4032,7 @@
               <w:rPr>
                 <w:lang w:val="es-ES"/>
               </w:rPr>
-              <w:t>“T</w:t>
-            </w:r>
-            <w:r>
-              <w:rPr>
-                <w:lang w:val="es-ES"/>
-              </w:rPr>
-              <w:t xml:space="preserve"> </w:t>
+              <w:t>“</w:t>
             </w:r>
             <w:r>
               <w:rPr>
@@ -5169,6 +5124,7 @@
           </w:p>
         </w:tc>
       </w:tr>
+      <w:bookmarkEnd w:id="5"/>
     </w:tbl>
     <w:p/>
     <w:p>
@@ -5178,7 +5134,7 @@
           <w:lang w:val="es-ES"/>
         </w:rPr>
       </w:pPr>
-      <w:bookmarkStart w:id="4" w:name="_Toc278820254"/>
+      <w:bookmarkStart w:id="6" w:name="_Toc216897051"/>
       <w:r>
         <w:rPr>
           <w:lang w:val="es-ES"/>
@@ -5186,7 +5142,7 @@
         <w:lastRenderedPageBreak/>
         <w:t>Necesidades ambientales</w:t>
       </w:r>
-      <w:bookmarkEnd w:id="4"/>
+      <w:bookmarkEnd w:id="6"/>
     </w:p>
     <w:p>
       <w:pPr>
@@ -5195,14 +5151,14 @@
           <w:lang w:val="es-ES"/>
         </w:rPr>
       </w:pPr>
-      <w:bookmarkStart w:id="5" w:name="_Toc278820255"/>
+      <w:bookmarkStart w:id="7" w:name="_Toc216897052"/>
       <w:r>
         <w:rPr>
           <w:lang w:val="es-ES"/>
         </w:rPr>
         <w:t>Hardware</w:t>
       </w:r>
-      <w:bookmarkEnd w:id="5"/>
+      <w:bookmarkEnd w:id="7"/>
     </w:p>
     <w:p>
       <w:pPr>
@@ -5228,21 +5184,7 @@
           <w:spacing w:val="-1"/>
           <w:w w:val="95"/>
         </w:rPr>
-        <w:t xml:space="preserve"> i</w:t>
-      </w:r>
-      <w:r>
-        <w:rPr>
-          <w:spacing w:val="-1"/>
-          <w:w w:val="95"/>
-        </w:rPr>
-        <w:t>5</w:t>
-      </w:r>
-      <w:r>
-        <w:rPr>
-          <w:spacing w:val="-1"/>
-          <w:w w:val="95"/>
-        </w:rPr>
-        <w:t>, RAM 32GB</w:t>
+        <w:t xml:space="preserve"> i5, RAM 32GB</w:t>
       </w:r>
     </w:p>
     <w:p>
@@ -5252,14 +5194,14 @@
           <w:lang w:val="es-ES"/>
         </w:rPr>
       </w:pPr>
-      <w:bookmarkStart w:id="6" w:name="_Toc278820256"/>
+      <w:bookmarkStart w:id="8" w:name="_Toc216897053"/>
       <w:r>
         <w:rPr>
           <w:lang w:val="es-ES"/>
         </w:rPr>
         <w:t>Software</w:t>
       </w:r>
-      <w:bookmarkEnd w:id="6"/>
+      <w:bookmarkEnd w:id="8"/>
     </w:p>
     <w:p>
       <w:pPr>
@@ -5298,14 +5240,14 @@
           <w:lang w:val="es-ES"/>
         </w:rPr>
       </w:pPr>
-      <w:bookmarkStart w:id="7" w:name="_Toc278820257"/>
+      <w:bookmarkStart w:id="9" w:name="_Toc216897054"/>
       <w:r>
         <w:rPr>
           <w:lang w:val="es-ES"/>
         </w:rPr>
         <w:t>Otros</w:t>
       </w:r>
-      <w:bookmarkEnd w:id="7"/>
+      <w:bookmarkEnd w:id="9"/>
     </w:p>
     <w:p>
       <w:pPr>
@@ -5336,14 +5278,14 @@
           <w:lang w:val="es-ES"/>
         </w:rPr>
       </w:pPr>
-      <w:bookmarkStart w:id="8" w:name="_Toc278820258"/>
+      <w:bookmarkStart w:id="10" w:name="_Toc216897055"/>
       <w:r>
         <w:rPr>
           <w:lang w:val="es-ES"/>
         </w:rPr>
         <w:t>Requisitos procedurales especiales</w:t>
       </w:r>
-      <w:bookmarkEnd w:id="8"/>
+      <w:bookmarkEnd w:id="10"/>
     </w:p>
     <w:p>
       <w:pPr>
@@ -5432,7 +5374,7 @@
           <w:lang w:val="es-ES"/>
         </w:rPr>
       </w:pPr>
-      <w:bookmarkStart w:id="9" w:name="_Toc278820259"/>
+      <w:bookmarkStart w:id="11" w:name="_Toc216897056"/>
       <w:r>
         <w:rPr>
           <w:lang w:val="es-ES"/>
@@ -5457,10 +5399,10 @@
         </w:rPr>
         <w:t xml:space="preserve"> de Prueba</w:t>
       </w:r>
-      <w:bookmarkEnd w:id="9"/>
+      <w:bookmarkEnd w:id="11"/>
     </w:p>
+    <w:bookmarkEnd w:id="0"/>
     <w:bookmarkEnd w:id="1"/>
-    <w:bookmarkEnd w:id="2"/>
     <w:p>
       <w:pPr>
         <w:ind w:left="708"/>
@@ -6893,6 +6835,7 @@
   <w:style w:type="character" w:default="1" w:styleId="Fuentedeprrafopredeter">
     <w:name w:val="Default Paragraph Font"/>
     <w:uiPriority w:val="1"/>
+    <w:semiHidden/>
     <w:unhideWhenUsed/>
   </w:style>
   <w:style w:type="table" w:default="1" w:styleId="Tablanormal">

</xml_diff>

<commit_message>
Corregido un error en la tabla de los casos de prueba
</commit_message>
<xml_diff>
--- a/test/AppForSEII2526.UIT/RentalCars/Casos de Prueba_UC2.docx
+++ b/test/AppForSEII2526.UIT/RentalCars/Casos de Prueba_UC2.docx
@@ -1398,6 +1398,7 @@
       <w:r>
         <w:rPr>
           <w:noProof/>
+          <w:lang w:val="es-ES"/>
         </w:rPr>
         <w:tab/>
       </w:r>
@@ -1410,6 +1411,7 @@
       <w:r>
         <w:rPr>
           <w:noProof/>
+          <w:lang w:val="es-ES"/>
         </w:rPr>
         <w:instrText xml:space="preserve"> PAGEREF _Toc216897056 \h </w:instrText>
       </w:r>
@@ -1427,6 +1429,7 @@
       <w:r>
         <w:rPr>
           <w:noProof/>
+          <w:lang w:val="es-ES"/>
         </w:rPr>
         <w:t>4</w:t>
       </w:r>
@@ -1500,16 +1503,16 @@
           <w:lang w:val="es-ES"/>
         </w:rPr>
       </w:pPr>
-      <w:bookmarkStart w:id="0" w:name="_Toc436203377"/>
-      <w:bookmarkStart w:id="1" w:name="_Toc452813577"/>
-      <w:bookmarkStart w:id="2" w:name="_Toc216897049"/>
+      <w:bookmarkStart w:id="0" w:name="_Toc216897049"/>
+      <w:bookmarkStart w:id="1" w:name="_Toc436203377"/>
+      <w:bookmarkStart w:id="2" w:name="_Toc452813577"/>
       <w:r>
         <w:rPr>
           <w:lang w:val="es-ES"/>
         </w:rPr>
         <w:t>Elementos de prueba</w:t>
       </w:r>
-      <w:bookmarkEnd w:id="2"/>
+      <w:bookmarkEnd w:id="0"/>
     </w:p>
     <w:p>
       <w:pPr>
@@ -3242,101 +3245,13 @@
             <w:tcW w:w="2268" w:type="dxa"/>
           </w:tcPr>
           <w:p>
-            <w:pPr>
-              <w:rPr>
-                <w:lang w:val="es-ES"/>
-              </w:rPr>
-            </w:pPr>
-            <w:proofErr w:type="spellStart"/>
-            <w:r>
-              <w:rPr>
-                <w:lang w:val="es-ES"/>
-              </w:rPr>
-              <w:t>Filtered</w:t>
-            </w:r>
-            <w:proofErr w:type="spellEnd"/>
-            <w:r>
-              <w:rPr>
-                <w:lang w:val="es-ES"/>
-              </w:rPr>
-              <w:t xml:space="preserve"> cars:</w:t>
-            </w:r>
-          </w:p>
-          <w:p>
-            <w:pPr>
-              <w:rPr>
-                <w:lang w:val="es-ES"/>
-              </w:rPr>
-            </w:pPr>
-            <w:proofErr w:type="spellStart"/>
-            <w:r>
-              <w:rPr>
-                <w:lang w:val="es-ES"/>
-              </w:rPr>
-              <w:t>There</w:t>
-            </w:r>
-            <w:proofErr w:type="spellEnd"/>
-            <w:r>
-              <w:rPr>
-                <w:lang w:val="es-ES"/>
-              </w:rPr>
-              <w:t xml:space="preserve"> are no cars </w:t>
-            </w:r>
-            <w:proofErr w:type="spellStart"/>
-            <w:r>
-              <w:rPr>
-                <w:lang w:val="es-ES"/>
-              </w:rPr>
-              <w:t>available</w:t>
-            </w:r>
-            <w:proofErr w:type="spellEnd"/>
-            <w:r>
-              <w:rPr>
-                <w:lang w:val="es-ES"/>
-              </w:rPr>
-              <w:t xml:space="preserve"> </w:t>
-            </w:r>
-            <w:proofErr w:type="spellStart"/>
-            <w:r>
-              <w:rPr>
-                <w:lang w:val="es-ES"/>
-              </w:rPr>
-              <w:t>for</w:t>
-            </w:r>
-            <w:proofErr w:type="spellEnd"/>
-            <w:r>
-              <w:rPr>
-                <w:lang w:val="es-ES"/>
-              </w:rPr>
-              <w:t xml:space="preserve"> </w:t>
-            </w:r>
-            <w:proofErr w:type="spellStart"/>
-            <w:r>
-              <w:rPr>
-                <w:lang w:val="es-ES"/>
-              </w:rPr>
-              <w:t>being</w:t>
-            </w:r>
-            <w:proofErr w:type="spellEnd"/>
-            <w:r>
-              <w:rPr>
-                <w:lang w:val="es-ES"/>
-              </w:rPr>
-              <w:t xml:space="preserve"> </w:t>
-            </w:r>
-            <w:proofErr w:type="spellStart"/>
-            <w:r>
-              <w:rPr>
-                <w:lang w:val="es-ES"/>
-              </w:rPr>
-              <w:t>rented</w:t>
-            </w:r>
-            <w:proofErr w:type="spellEnd"/>
-            <w:r>
-              <w:rPr>
-                <w:lang w:val="es-ES"/>
-              </w:rPr>
-              <w:t>.</w:t>
+            <w:r>
+              <w:t>Filtered cars:</w:t>
+            </w:r>
+          </w:p>
+          <w:p>
+            <w:r>
+              <w:t>There are no cars available for being rented.</w:t>
             </w:r>
           </w:p>
         </w:tc>
@@ -3782,25 +3697,8 @@
               <w:t>“</w:t>
             </w:r>
             <w:r>
-              <w:rPr>
-                <w:lang w:val="es-ES"/>
-              </w:rPr>
-              <w:t>Volkswagen</w:t>
-            </w:r>
-            <w:r>
-              <w:rPr>
-                <w:lang w:val="es-ES"/>
-              </w:rPr>
-              <w:t xml:space="preserve"> Pickup </w:t>
-            </w:r>
-            <w:proofErr w:type="spellStart"/>
-            <w:r>
-              <w:rPr>
-                <w:lang w:val="es-ES"/>
-              </w:rPr>
-              <w:t>Truck</w:t>
-            </w:r>
-            <w:proofErr w:type="spellEnd"/>
+              <w:t>Volkswagen Pickup Truck</w:t>
+            </w:r>
             <w:r>
               <w:t>”</w:t>
             </w:r>
@@ -4002,6 +3900,22 @@
             <w:tcW w:w="1701" w:type="dxa"/>
           </w:tcPr>
           <w:p>
+            <w:r>
+              <w:t>Select:</w:t>
+            </w:r>
+          </w:p>
+          <w:p>
+            <w:r>
+              <w:t>“Volkswagen Pickup Truck”,</w:t>
+            </w:r>
+          </w:p>
+          <w:p>
+            <w:r>
+              <w:t>“Audi Sedan”,</w:t>
+            </w:r>
+          </w:p>
+          <w:p/>
+          <w:p>
             <w:pPr>
               <w:rPr>
                 <w:lang w:val="es-ES"/>
@@ -4012,7 +3926,7 @@
               <w:rPr>
                 <w:lang w:val="es-ES"/>
               </w:rPr>
-              <w:t>Select</w:t>
+              <w:t>Deselect</w:t>
             </w:r>
             <w:proofErr w:type="spellEnd"/>
             <w:r>
@@ -4038,217 +3952,135 @@
               <w:rPr>
                 <w:lang w:val="es-ES"/>
               </w:rPr>
+              <w:t>Audi Sedan</w:t>
+            </w:r>
+            <w:r>
+              <w:rPr>
+                <w:lang w:val="es-ES"/>
+              </w:rPr>
+              <w:t>”</w:t>
+            </w:r>
+          </w:p>
+        </w:tc>
+        <w:tc>
+          <w:tcPr>
+            <w:tcW w:w="992" w:type="dxa"/>
+          </w:tcPr>
+          <w:p>
+            <w:pPr>
+              <w:rPr>
+                <w:lang w:val="es-ES"/>
+              </w:rPr>
+            </w:pPr>
+          </w:p>
+        </w:tc>
+        <w:tc>
+          <w:tcPr>
+            <w:tcW w:w="992" w:type="dxa"/>
+          </w:tcPr>
+          <w:p>
+            <w:pPr>
+              <w:rPr>
+                <w:lang w:val="es-ES"/>
+              </w:rPr>
+            </w:pPr>
+          </w:p>
+        </w:tc>
+        <w:tc>
+          <w:tcPr>
+            <w:tcW w:w="1134" w:type="dxa"/>
+          </w:tcPr>
+          <w:p>
+            <w:pPr>
+              <w:rPr>
+                <w:lang w:val="es-ES"/>
+              </w:rPr>
+            </w:pPr>
+            <w:r>
+              <w:rPr>
+                <w:lang w:val="es-ES"/>
+              </w:rPr>
+              <w:t>Today+2</w:t>
+            </w:r>
+          </w:p>
+        </w:tc>
+        <w:tc>
+          <w:tcPr>
+            <w:tcW w:w="1134" w:type="dxa"/>
+          </w:tcPr>
+          <w:p>
+            <w:pPr>
+              <w:rPr>
+                <w:lang w:val="es-ES"/>
+              </w:rPr>
+            </w:pPr>
+            <w:r>
+              <w:rPr>
+                <w:lang w:val="es-ES"/>
+              </w:rPr>
+              <w:t>Today+3</w:t>
+            </w:r>
+          </w:p>
+        </w:tc>
+        <w:tc>
+          <w:tcPr>
+            <w:tcW w:w="1276" w:type="dxa"/>
+          </w:tcPr>
+          <w:p>
+            <w:pPr>
+              <w:rPr>
+                <w:lang w:val="es-ES"/>
+              </w:rPr>
+            </w:pPr>
+            <w:r>
+              <w:rPr>
+                <w:lang w:val="es-ES"/>
+              </w:rPr>
+              <w:t>Today+1</w:t>
+            </w:r>
+          </w:p>
+        </w:tc>
+        <w:tc>
+          <w:tcPr>
+            <w:tcW w:w="1984" w:type="dxa"/>
+          </w:tcPr>
+          <w:p>
+            <w:pPr>
+              <w:rPr>
+                <w:lang w:val="es-ES"/>
+              </w:rPr>
+            </w:pPr>
+          </w:p>
+        </w:tc>
+        <w:tc>
+          <w:tcPr>
+            <w:tcW w:w="2268" w:type="dxa"/>
+          </w:tcPr>
+          <w:p>
+            <w:r>
+              <w:t>Shown:</w:t>
+            </w:r>
+          </w:p>
+          <w:p>
+            <w:pPr>
+              <w:rPr>
+                <w:u w:val="single"/>
+              </w:rPr>
+            </w:pPr>
+            <w:r>
+              <w:t>“</w:t>
+            </w:r>
+            <w:r>
               <w:t>Volkswagen</w:t>
             </w:r>
             <w:r>
-              <w:rPr>
-                <w:lang w:val="es-ES"/>
-              </w:rPr>
-              <w:t xml:space="preserve"> Pickup </w:t>
-            </w:r>
-            <w:proofErr w:type="spellStart"/>
-            <w:r>
-              <w:rPr>
-                <w:lang w:val="es-ES"/>
-              </w:rPr>
-              <w:t>Truck</w:t>
-            </w:r>
-            <w:proofErr w:type="spellEnd"/>
-            <w:r>
-              <w:rPr>
-                <w:lang w:val="es-ES"/>
-              </w:rPr>
-              <w:t>”,</w:t>
-            </w:r>
-          </w:p>
-          <w:p>
-            <w:pPr>
-              <w:rPr>
-                <w:lang w:val="es-ES"/>
-              </w:rPr>
-            </w:pPr>
-            <w:r>
-              <w:rPr>
-                <w:lang w:val="es-ES"/>
-              </w:rPr>
-              <w:t>“Audi Sedan”,</w:t>
-            </w:r>
-          </w:p>
-          <w:p>
-            <w:pPr>
-              <w:rPr>
-                <w:lang w:val="es-ES"/>
-              </w:rPr>
-            </w:pPr>
-          </w:p>
-          <w:p>
-            <w:pPr>
-              <w:rPr>
-                <w:lang w:val="es-ES"/>
-              </w:rPr>
-            </w:pPr>
-            <w:proofErr w:type="spellStart"/>
-            <w:r>
-              <w:rPr>
-                <w:lang w:val="es-ES"/>
-              </w:rPr>
-              <w:t>Deselect</w:t>
-            </w:r>
-            <w:proofErr w:type="spellEnd"/>
-            <w:r>
-              <w:rPr>
-                <w:lang w:val="es-ES"/>
-              </w:rPr>
-              <w:t>:</w:t>
-            </w:r>
-          </w:p>
-          <w:p>
-            <w:pPr>
-              <w:rPr>
-                <w:lang w:val="es-ES"/>
-              </w:rPr>
-            </w:pPr>
-            <w:r>
-              <w:rPr>
-                <w:lang w:val="es-ES"/>
-              </w:rPr>
-              <w:t>“</w:t>
-            </w:r>
-            <w:r>
-              <w:rPr>
-                <w:lang w:val="es-ES"/>
-              </w:rPr>
-              <w:t>Volkswagen</w:t>
-            </w:r>
-            <w:r>
-              <w:rPr>
-                <w:lang w:val="es-ES"/>
-              </w:rPr>
-              <w:t xml:space="preserve"> Pickup </w:t>
-            </w:r>
-            <w:proofErr w:type="spellStart"/>
-            <w:r>
-              <w:rPr>
-                <w:lang w:val="es-ES"/>
-              </w:rPr>
-              <w:t>Truck</w:t>
-            </w:r>
-            <w:proofErr w:type="spellEnd"/>
-            <w:r>
-              <w:rPr>
-                <w:lang w:val="es-ES"/>
-              </w:rPr>
-              <w:t>”</w:t>
-            </w:r>
-          </w:p>
-        </w:tc>
-        <w:tc>
-          <w:tcPr>
-            <w:tcW w:w="992" w:type="dxa"/>
-          </w:tcPr>
-          <w:p>
-            <w:pPr>
-              <w:rPr>
-                <w:lang w:val="es-ES"/>
-              </w:rPr>
-            </w:pPr>
-          </w:p>
-        </w:tc>
-        <w:tc>
-          <w:tcPr>
-            <w:tcW w:w="992" w:type="dxa"/>
-          </w:tcPr>
-          <w:p>
-            <w:pPr>
-              <w:rPr>
-                <w:lang w:val="es-ES"/>
-              </w:rPr>
-            </w:pPr>
-          </w:p>
-        </w:tc>
-        <w:tc>
-          <w:tcPr>
-            <w:tcW w:w="1134" w:type="dxa"/>
-          </w:tcPr>
-          <w:p>
-            <w:pPr>
-              <w:rPr>
-                <w:lang w:val="es-ES"/>
-              </w:rPr>
-            </w:pPr>
-            <w:r>
-              <w:rPr>
-                <w:lang w:val="es-ES"/>
-              </w:rPr>
-              <w:t>Today+2</w:t>
-            </w:r>
-          </w:p>
-        </w:tc>
-        <w:tc>
-          <w:tcPr>
-            <w:tcW w:w="1134" w:type="dxa"/>
-          </w:tcPr>
-          <w:p>
-            <w:pPr>
-              <w:rPr>
-                <w:lang w:val="es-ES"/>
-              </w:rPr>
-            </w:pPr>
-            <w:r>
-              <w:rPr>
-                <w:lang w:val="es-ES"/>
-              </w:rPr>
-              <w:t>Today+3</w:t>
-            </w:r>
-          </w:p>
-        </w:tc>
-        <w:tc>
-          <w:tcPr>
-            <w:tcW w:w="1276" w:type="dxa"/>
-          </w:tcPr>
-          <w:p>
-            <w:pPr>
-              <w:rPr>
-                <w:lang w:val="es-ES"/>
-              </w:rPr>
-            </w:pPr>
-            <w:r>
-              <w:rPr>
-                <w:lang w:val="es-ES"/>
-              </w:rPr>
-              <w:t>Today+1</w:t>
-            </w:r>
-          </w:p>
-        </w:tc>
-        <w:tc>
-          <w:tcPr>
-            <w:tcW w:w="1984" w:type="dxa"/>
-          </w:tcPr>
-          <w:p>
-            <w:pPr>
-              <w:rPr>
-                <w:lang w:val="es-ES"/>
-              </w:rPr>
-            </w:pPr>
-          </w:p>
-        </w:tc>
-        <w:tc>
-          <w:tcPr>
-            <w:tcW w:w="2268" w:type="dxa"/>
-          </w:tcPr>
-          <w:p>
-            <w:r>
-              <w:t>Shown:</w:t>
-            </w:r>
-          </w:p>
-          <w:p>
-            <w:pPr>
-              <w:rPr>
-                <w:u w:val="single"/>
-              </w:rPr>
-            </w:pPr>
-            <w:r>
-              <w:t>“Audi Sedan – 280€, Total Price: 280€”</w:t>
+              <w:t xml:space="preserve"> </w:t>
+            </w:r>
+            <w:r>
+              <w:t>Pickup Truck</w:t>
+            </w:r>
+            <w:r>
+              <w:t xml:space="preserve"> – 80€, Total Price: 80€”</w:t>
             </w:r>
           </w:p>
         </w:tc>
@@ -4857,44 +4689,58 @@
                 <w:lang w:val="es-ES"/>
               </w:rPr>
             </w:pPr>
+            <w:r>
+              <w:rPr>
+                <w:lang w:val="es-ES"/>
+              </w:rPr>
+              <w:t>Modificar</w:t>
+            </w:r>
+            <w:r>
+              <w:rPr>
+                <w:lang w:val="es-ES"/>
+              </w:rPr>
+              <w:t xml:space="preserve"> coches seleccionados</w:t>
+            </w:r>
+          </w:p>
+        </w:tc>
+        <w:tc>
+          <w:tcPr>
+            <w:tcW w:w="1701" w:type="dxa"/>
+          </w:tcPr>
+          <w:p>
+            <w:r>
+              <w:t>Select:</w:t>
+            </w:r>
+          </w:p>
+          <w:p>
+            <w:r>
+              <w:t>“Volkswagen Pickup Truck”,</w:t>
+            </w:r>
+          </w:p>
+          <w:p>
+            <w:r>
+              <w:t>“Audi Sedan”,</w:t>
+            </w:r>
+          </w:p>
+          <w:p/>
+          <w:p>
+            <w:pPr>
+              <w:rPr>
+                <w:lang w:val="es-ES"/>
+              </w:rPr>
+            </w:pPr>
             <w:proofErr w:type="spellStart"/>
             <w:r>
               <w:rPr>
                 <w:lang w:val="es-ES"/>
               </w:rPr>
-              <w:t>Módificar</w:t>
+              <w:t>Deselect</w:t>
             </w:r>
             <w:proofErr w:type="spellEnd"/>
             <w:r>
               <w:rPr>
                 <w:lang w:val="es-ES"/>
               </w:rPr>
-              <w:t xml:space="preserve"> coches seleccionados</w:t>
-            </w:r>
-          </w:p>
-        </w:tc>
-        <w:tc>
-          <w:tcPr>
-            <w:tcW w:w="1701" w:type="dxa"/>
-          </w:tcPr>
-          <w:p>
-            <w:pPr>
-              <w:rPr>
-                <w:lang w:val="es-ES"/>
-              </w:rPr>
-            </w:pPr>
-            <w:proofErr w:type="spellStart"/>
-            <w:r>
-              <w:rPr>
-                <w:lang w:val="es-ES"/>
-              </w:rPr>
-              <w:t>Select</w:t>
-            </w:r>
-            <w:proofErr w:type="spellEnd"/>
-            <w:r>
-              <w:rPr>
-                <w:lang w:val="es-ES"/>
-              </w:rPr>
               <w:t>:</w:t>
             </w:r>
           </w:p>
@@ -4911,215 +4757,135 @@
               <w:t>“</w:t>
             </w:r>
             <w:r>
-              <w:rPr>
-                <w:lang w:val="es-ES"/>
-              </w:rPr>
+              <w:t>Audi Sedan</w:t>
+            </w:r>
+            <w:r>
+              <w:rPr>
+                <w:lang w:val="es-ES"/>
+              </w:rPr>
+              <w:t>”</w:t>
+            </w:r>
+          </w:p>
+        </w:tc>
+        <w:tc>
+          <w:tcPr>
+            <w:tcW w:w="992" w:type="dxa"/>
+          </w:tcPr>
+          <w:p>
+            <w:pPr>
+              <w:rPr>
+                <w:lang w:val="es-ES"/>
+              </w:rPr>
+            </w:pPr>
+          </w:p>
+        </w:tc>
+        <w:tc>
+          <w:tcPr>
+            <w:tcW w:w="992" w:type="dxa"/>
+          </w:tcPr>
+          <w:p>
+            <w:pPr>
+              <w:rPr>
+                <w:lang w:val="es-ES"/>
+              </w:rPr>
+            </w:pPr>
+          </w:p>
+        </w:tc>
+        <w:tc>
+          <w:tcPr>
+            <w:tcW w:w="1134" w:type="dxa"/>
+          </w:tcPr>
+          <w:p>
+            <w:pPr>
+              <w:rPr>
+                <w:lang w:val="es-ES"/>
+              </w:rPr>
+            </w:pPr>
+            <w:r>
+              <w:rPr>
+                <w:lang w:val="es-ES"/>
+              </w:rPr>
+              <w:t>Today+2</w:t>
+            </w:r>
+          </w:p>
+        </w:tc>
+        <w:tc>
+          <w:tcPr>
+            <w:tcW w:w="1134" w:type="dxa"/>
+          </w:tcPr>
+          <w:p>
+            <w:pPr>
+              <w:rPr>
+                <w:lang w:val="es-ES"/>
+              </w:rPr>
+            </w:pPr>
+            <w:r>
+              <w:rPr>
+                <w:lang w:val="es-ES"/>
+              </w:rPr>
+              <w:t>Today+3</w:t>
+            </w:r>
+          </w:p>
+        </w:tc>
+        <w:tc>
+          <w:tcPr>
+            <w:tcW w:w="1276" w:type="dxa"/>
+          </w:tcPr>
+          <w:p>
+            <w:pPr>
+              <w:rPr>
+                <w:lang w:val="es-ES"/>
+              </w:rPr>
+            </w:pPr>
+            <w:r>
+              <w:rPr>
+                <w:lang w:val="es-ES"/>
+              </w:rPr>
+              <w:t>Today+1</w:t>
+            </w:r>
+          </w:p>
+        </w:tc>
+        <w:tc>
+          <w:tcPr>
+            <w:tcW w:w="1984" w:type="dxa"/>
+          </w:tcPr>
+          <w:p>
+            <w:pPr>
+              <w:rPr>
+                <w:lang w:val="es-ES"/>
+              </w:rPr>
+            </w:pPr>
+          </w:p>
+        </w:tc>
+        <w:tc>
+          <w:tcPr>
+            <w:tcW w:w="2268" w:type="dxa"/>
+          </w:tcPr>
+          <w:p>
+            <w:r>
+              <w:t>Shown:</w:t>
+            </w:r>
+          </w:p>
+          <w:p>
+            <w:pPr>
+              <w:rPr>
+                <w:u w:val="single"/>
+              </w:rPr>
+            </w:pPr>
+            <w:r>
+              <w:t>“</w:t>
+            </w:r>
+            <w:r>
               <w:t>Volkswagen</w:t>
             </w:r>
             <w:r>
-              <w:rPr>
-                <w:lang w:val="es-ES"/>
-              </w:rPr>
-              <w:t xml:space="preserve"> Pickup </w:t>
-            </w:r>
-            <w:proofErr w:type="spellStart"/>
-            <w:r>
-              <w:rPr>
-                <w:lang w:val="es-ES"/>
-              </w:rPr>
-              <w:t>Truck</w:t>
-            </w:r>
-            <w:proofErr w:type="spellEnd"/>
-            <w:r>
-              <w:rPr>
-                <w:lang w:val="es-ES"/>
-              </w:rPr>
-              <w:t>”,</w:t>
-            </w:r>
-          </w:p>
-          <w:p>
-            <w:pPr>
-              <w:rPr>
-                <w:lang w:val="es-ES"/>
-              </w:rPr>
-            </w:pPr>
-            <w:r>
-              <w:rPr>
-                <w:lang w:val="es-ES"/>
-              </w:rPr>
-              <w:t>“Audi Sedan”,</w:t>
-            </w:r>
-          </w:p>
-          <w:p>
-            <w:pPr>
-              <w:rPr>
-                <w:lang w:val="es-ES"/>
-              </w:rPr>
-            </w:pPr>
-          </w:p>
-          <w:p>
-            <w:pPr>
-              <w:rPr>
-                <w:lang w:val="es-ES"/>
-              </w:rPr>
-            </w:pPr>
-            <w:proofErr w:type="spellStart"/>
-            <w:r>
-              <w:rPr>
-                <w:lang w:val="es-ES"/>
-              </w:rPr>
-              <w:t>Deselect</w:t>
-            </w:r>
-            <w:proofErr w:type="spellEnd"/>
-            <w:r>
-              <w:rPr>
-                <w:lang w:val="es-ES"/>
-              </w:rPr>
-              <w:t>:</w:t>
-            </w:r>
-          </w:p>
-          <w:p>
-            <w:pPr>
-              <w:rPr>
-                <w:lang w:val="es-ES"/>
-              </w:rPr>
-            </w:pPr>
-            <w:r>
-              <w:rPr>
-                <w:lang w:val="es-ES"/>
-              </w:rPr>
-              <w:t>“</w:t>
-            </w:r>
-            <w:r>
-              <w:rPr>
-                <w:lang w:val="es-ES"/>
-              </w:rPr>
-              <w:t>Volkswagen</w:t>
-            </w:r>
-            <w:r>
-              <w:rPr>
-                <w:lang w:val="es-ES"/>
-              </w:rPr>
-              <w:t xml:space="preserve"> Pickup </w:t>
-            </w:r>
-            <w:proofErr w:type="spellStart"/>
-            <w:r>
-              <w:rPr>
-                <w:lang w:val="es-ES"/>
-              </w:rPr>
-              <w:t>Truck</w:t>
-            </w:r>
-            <w:proofErr w:type="spellEnd"/>
-            <w:r>
-              <w:rPr>
-                <w:lang w:val="es-ES"/>
-              </w:rPr>
-              <w:t>”</w:t>
-            </w:r>
-          </w:p>
-        </w:tc>
-        <w:tc>
-          <w:tcPr>
-            <w:tcW w:w="992" w:type="dxa"/>
-          </w:tcPr>
-          <w:p>
-            <w:pPr>
-              <w:rPr>
-                <w:lang w:val="es-ES"/>
-              </w:rPr>
-            </w:pPr>
-          </w:p>
-        </w:tc>
-        <w:tc>
-          <w:tcPr>
-            <w:tcW w:w="992" w:type="dxa"/>
-          </w:tcPr>
-          <w:p>
-            <w:pPr>
-              <w:rPr>
-                <w:lang w:val="es-ES"/>
-              </w:rPr>
-            </w:pPr>
-          </w:p>
-        </w:tc>
-        <w:tc>
-          <w:tcPr>
-            <w:tcW w:w="1134" w:type="dxa"/>
-          </w:tcPr>
-          <w:p>
-            <w:pPr>
-              <w:rPr>
-                <w:lang w:val="es-ES"/>
-              </w:rPr>
-            </w:pPr>
-            <w:r>
-              <w:rPr>
-                <w:lang w:val="es-ES"/>
-              </w:rPr>
-              <w:t>Today+2</w:t>
-            </w:r>
-          </w:p>
-        </w:tc>
-        <w:tc>
-          <w:tcPr>
-            <w:tcW w:w="1134" w:type="dxa"/>
-          </w:tcPr>
-          <w:p>
-            <w:pPr>
-              <w:rPr>
-                <w:lang w:val="es-ES"/>
-              </w:rPr>
-            </w:pPr>
-            <w:r>
-              <w:rPr>
-                <w:lang w:val="es-ES"/>
-              </w:rPr>
-              <w:t>Today+3</w:t>
-            </w:r>
-          </w:p>
-        </w:tc>
-        <w:tc>
-          <w:tcPr>
-            <w:tcW w:w="1276" w:type="dxa"/>
-          </w:tcPr>
-          <w:p>
-            <w:pPr>
-              <w:rPr>
-                <w:lang w:val="es-ES"/>
-              </w:rPr>
-            </w:pPr>
-            <w:r>
-              <w:rPr>
-                <w:lang w:val="es-ES"/>
-              </w:rPr>
-              <w:t>Today+1</w:t>
-            </w:r>
-          </w:p>
-        </w:tc>
-        <w:tc>
-          <w:tcPr>
-            <w:tcW w:w="1984" w:type="dxa"/>
-          </w:tcPr>
-          <w:p>
-            <w:pPr>
-              <w:rPr>
-                <w:lang w:val="es-ES"/>
-              </w:rPr>
-            </w:pPr>
-          </w:p>
-        </w:tc>
-        <w:tc>
-          <w:tcPr>
-            <w:tcW w:w="2268" w:type="dxa"/>
-          </w:tcPr>
-          <w:p>
-            <w:r>
-              <w:t>Shown:</w:t>
-            </w:r>
-          </w:p>
-          <w:p>
-            <w:r>
-              <w:t>“Audi Sedan – 280€, Total Price: 280€”</w:t>
+              <w:t xml:space="preserve"> </w:t>
+            </w:r>
+            <w:r>
+              <w:t>Pickup Truck</w:t>
+            </w:r>
+            <w:r>
+              <w:t xml:space="preserve"> – 80€, Total Price: 80€”</w:t>
             </w:r>
           </w:p>
         </w:tc>
@@ -5401,8 +5167,8 @@
       </w:r>
       <w:bookmarkEnd w:id="11"/>
     </w:p>
-    <w:bookmarkEnd w:id="0"/>
     <w:bookmarkEnd w:id="1"/>
+    <w:bookmarkEnd w:id="2"/>
     <w:p>
       <w:pPr>
         <w:ind w:left="708"/>

</xml_diff>

<commit_message>
Corregido un error en la tabla de los casos de prueba (#255)
</commit_message>
<xml_diff>
--- a/test/AppForSEII2526.UIT/RentalCars/Casos de Prueba_UC2.docx
+++ b/test/AppForSEII2526.UIT/RentalCars/Casos de Prueba_UC2.docx
@@ -1398,6 +1398,7 @@
       <w:r>
         <w:rPr>
           <w:noProof/>
+          <w:lang w:val="es-ES"/>
         </w:rPr>
         <w:tab/>
       </w:r>
@@ -1410,6 +1411,7 @@
       <w:r>
         <w:rPr>
           <w:noProof/>
+          <w:lang w:val="es-ES"/>
         </w:rPr>
         <w:instrText xml:space="preserve"> PAGEREF _Toc216897056 \h </w:instrText>
       </w:r>
@@ -1427,6 +1429,7 @@
       <w:r>
         <w:rPr>
           <w:noProof/>
+          <w:lang w:val="es-ES"/>
         </w:rPr>
         <w:t>4</w:t>
       </w:r>
@@ -1500,16 +1503,16 @@
           <w:lang w:val="es-ES"/>
         </w:rPr>
       </w:pPr>
-      <w:bookmarkStart w:id="0" w:name="_Toc436203377"/>
-      <w:bookmarkStart w:id="1" w:name="_Toc452813577"/>
-      <w:bookmarkStart w:id="2" w:name="_Toc216897049"/>
+      <w:bookmarkStart w:id="0" w:name="_Toc216897049"/>
+      <w:bookmarkStart w:id="1" w:name="_Toc436203377"/>
+      <w:bookmarkStart w:id="2" w:name="_Toc452813577"/>
       <w:r>
         <w:rPr>
           <w:lang w:val="es-ES"/>
         </w:rPr>
         <w:t>Elementos de prueba</w:t>
       </w:r>
-      <w:bookmarkEnd w:id="2"/>
+      <w:bookmarkEnd w:id="0"/>
     </w:p>
     <w:p>
       <w:pPr>
@@ -3242,101 +3245,13 @@
             <w:tcW w:w="2268" w:type="dxa"/>
           </w:tcPr>
           <w:p>
-            <w:pPr>
-              <w:rPr>
-                <w:lang w:val="es-ES"/>
-              </w:rPr>
-            </w:pPr>
-            <w:proofErr w:type="spellStart"/>
-            <w:r>
-              <w:rPr>
-                <w:lang w:val="es-ES"/>
-              </w:rPr>
-              <w:t>Filtered</w:t>
-            </w:r>
-            <w:proofErr w:type="spellEnd"/>
-            <w:r>
-              <w:rPr>
-                <w:lang w:val="es-ES"/>
-              </w:rPr>
-              <w:t xml:space="preserve"> cars:</w:t>
-            </w:r>
-          </w:p>
-          <w:p>
-            <w:pPr>
-              <w:rPr>
-                <w:lang w:val="es-ES"/>
-              </w:rPr>
-            </w:pPr>
-            <w:proofErr w:type="spellStart"/>
-            <w:r>
-              <w:rPr>
-                <w:lang w:val="es-ES"/>
-              </w:rPr>
-              <w:t>There</w:t>
-            </w:r>
-            <w:proofErr w:type="spellEnd"/>
-            <w:r>
-              <w:rPr>
-                <w:lang w:val="es-ES"/>
-              </w:rPr>
-              <w:t xml:space="preserve"> are no cars </w:t>
-            </w:r>
-            <w:proofErr w:type="spellStart"/>
-            <w:r>
-              <w:rPr>
-                <w:lang w:val="es-ES"/>
-              </w:rPr>
-              <w:t>available</w:t>
-            </w:r>
-            <w:proofErr w:type="spellEnd"/>
-            <w:r>
-              <w:rPr>
-                <w:lang w:val="es-ES"/>
-              </w:rPr>
-              <w:t xml:space="preserve"> </w:t>
-            </w:r>
-            <w:proofErr w:type="spellStart"/>
-            <w:r>
-              <w:rPr>
-                <w:lang w:val="es-ES"/>
-              </w:rPr>
-              <w:t>for</w:t>
-            </w:r>
-            <w:proofErr w:type="spellEnd"/>
-            <w:r>
-              <w:rPr>
-                <w:lang w:val="es-ES"/>
-              </w:rPr>
-              <w:t xml:space="preserve"> </w:t>
-            </w:r>
-            <w:proofErr w:type="spellStart"/>
-            <w:r>
-              <w:rPr>
-                <w:lang w:val="es-ES"/>
-              </w:rPr>
-              <w:t>being</w:t>
-            </w:r>
-            <w:proofErr w:type="spellEnd"/>
-            <w:r>
-              <w:rPr>
-                <w:lang w:val="es-ES"/>
-              </w:rPr>
-              <w:t xml:space="preserve"> </w:t>
-            </w:r>
-            <w:proofErr w:type="spellStart"/>
-            <w:r>
-              <w:rPr>
-                <w:lang w:val="es-ES"/>
-              </w:rPr>
-              <w:t>rented</w:t>
-            </w:r>
-            <w:proofErr w:type="spellEnd"/>
-            <w:r>
-              <w:rPr>
-                <w:lang w:val="es-ES"/>
-              </w:rPr>
-              <w:t>.</w:t>
+            <w:r>
+              <w:t>Filtered cars:</w:t>
+            </w:r>
+          </w:p>
+          <w:p>
+            <w:r>
+              <w:t>There are no cars available for being rented.</w:t>
             </w:r>
           </w:p>
         </w:tc>
@@ -3782,25 +3697,8 @@
               <w:t>“</w:t>
             </w:r>
             <w:r>
-              <w:rPr>
-                <w:lang w:val="es-ES"/>
-              </w:rPr>
-              <w:t>Volkswagen</w:t>
-            </w:r>
-            <w:r>
-              <w:rPr>
-                <w:lang w:val="es-ES"/>
-              </w:rPr>
-              <w:t xml:space="preserve"> Pickup </w:t>
-            </w:r>
-            <w:proofErr w:type="spellStart"/>
-            <w:r>
-              <w:rPr>
-                <w:lang w:val="es-ES"/>
-              </w:rPr>
-              <w:t>Truck</w:t>
-            </w:r>
-            <w:proofErr w:type="spellEnd"/>
+              <w:t>Volkswagen Pickup Truck</w:t>
+            </w:r>
             <w:r>
               <w:t>”</w:t>
             </w:r>
@@ -4002,6 +3900,22 @@
             <w:tcW w:w="1701" w:type="dxa"/>
           </w:tcPr>
           <w:p>
+            <w:r>
+              <w:t>Select:</w:t>
+            </w:r>
+          </w:p>
+          <w:p>
+            <w:r>
+              <w:t>“Volkswagen Pickup Truck”,</w:t>
+            </w:r>
+          </w:p>
+          <w:p>
+            <w:r>
+              <w:t>“Audi Sedan”,</w:t>
+            </w:r>
+          </w:p>
+          <w:p/>
+          <w:p>
             <w:pPr>
               <w:rPr>
                 <w:lang w:val="es-ES"/>
@@ -4012,7 +3926,7 @@
               <w:rPr>
                 <w:lang w:val="es-ES"/>
               </w:rPr>
-              <w:t>Select</w:t>
+              <w:t>Deselect</w:t>
             </w:r>
             <w:proofErr w:type="spellEnd"/>
             <w:r>
@@ -4038,217 +3952,135 @@
               <w:rPr>
                 <w:lang w:val="es-ES"/>
               </w:rPr>
+              <w:t>Audi Sedan</w:t>
+            </w:r>
+            <w:r>
+              <w:rPr>
+                <w:lang w:val="es-ES"/>
+              </w:rPr>
+              <w:t>”</w:t>
+            </w:r>
+          </w:p>
+        </w:tc>
+        <w:tc>
+          <w:tcPr>
+            <w:tcW w:w="992" w:type="dxa"/>
+          </w:tcPr>
+          <w:p>
+            <w:pPr>
+              <w:rPr>
+                <w:lang w:val="es-ES"/>
+              </w:rPr>
+            </w:pPr>
+          </w:p>
+        </w:tc>
+        <w:tc>
+          <w:tcPr>
+            <w:tcW w:w="992" w:type="dxa"/>
+          </w:tcPr>
+          <w:p>
+            <w:pPr>
+              <w:rPr>
+                <w:lang w:val="es-ES"/>
+              </w:rPr>
+            </w:pPr>
+          </w:p>
+        </w:tc>
+        <w:tc>
+          <w:tcPr>
+            <w:tcW w:w="1134" w:type="dxa"/>
+          </w:tcPr>
+          <w:p>
+            <w:pPr>
+              <w:rPr>
+                <w:lang w:val="es-ES"/>
+              </w:rPr>
+            </w:pPr>
+            <w:r>
+              <w:rPr>
+                <w:lang w:val="es-ES"/>
+              </w:rPr>
+              <w:t>Today+2</w:t>
+            </w:r>
+          </w:p>
+        </w:tc>
+        <w:tc>
+          <w:tcPr>
+            <w:tcW w:w="1134" w:type="dxa"/>
+          </w:tcPr>
+          <w:p>
+            <w:pPr>
+              <w:rPr>
+                <w:lang w:val="es-ES"/>
+              </w:rPr>
+            </w:pPr>
+            <w:r>
+              <w:rPr>
+                <w:lang w:val="es-ES"/>
+              </w:rPr>
+              <w:t>Today+3</w:t>
+            </w:r>
+          </w:p>
+        </w:tc>
+        <w:tc>
+          <w:tcPr>
+            <w:tcW w:w="1276" w:type="dxa"/>
+          </w:tcPr>
+          <w:p>
+            <w:pPr>
+              <w:rPr>
+                <w:lang w:val="es-ES"/>
+              </w:rPr>
+            </w:pPr>
+            <w:r>
+              <w:rPr>
+                <w:lang w:val="es-ES"/>
+              </w:rPr>
+              <w:t>Today+1</w:t>
+            </w:r>
+          </w:p>
+        </w:tc>
+        <w:tc>
+          <w:tcPr>
+            <w:tcW w:w="1984" w:type="dxa"/>
+          </w:tcPr>
+          <w:p>
+            <w:pPr>
+              <w:rPr>
+                <w:lang w:val="es-ES"/>
+              </w:rPr>
+            </w:pPr>
+          </w:p>
+        </w:tc>
+        <w:tc>
+          <w:tcPr>
+            <w:tcW w:w="2268" w:type="dxa"/>
+          </w:tcPr>
+          <w:p>
+            <w:r>
+              <w:t>Shown:</w:t>
+            </w:r>
+          </w:p>
+          <w:p>
+            <w:pPr>
+              <w:rPr>
+                <w:u w:val="single"/>
+              </w:rPr>
+            </w:pPr>
+            <w:r>
+              <w:t>“</w:t>
+            </w:r>
+            <w:r>
               <w:t>Volkswagen</w:t>
             </w:r>
             <w:r>
-              <w:rPr>
-                <w:lang w:val="es-ES"/>
-              </w:rPr>
-              <w:t xml:space="preserve"> Pickup </w:t>
-            </w:r>
-            <w:proofErr w:type="spellStart"/>
-            <w:r>
-              <w:rPr>
-                <w:lang w:val="es-ES"/>
-              </w:rPr>
-              <w:t>Truck</w:t>
-            </w:r>
-            <w:proofErr w:type="spellEnd"/>
-            <w:r>
-              <w:rPr>
-                <w:lang w:val="es-ES"/>
-              </w:rPr>
-              <w:t>”,</w:t>
-            </w:r>
-          </w:p>
-          <w:p>
-            <w:pPr>
-              <w:rPr>
-                <w:lang w:val="es-ES"/>
-              </w:rPr>
-            </w:pPr>
-            <w:r>
-              <w:rPr>
-                <w:lang w:val="es-ES"/>
-              </w:rPr>
-              <w:t>“Audi Sedan”,</w:t>
-            </w:r>
-          </w:p>
-          <w:p>
-            <w:pPr>
-              <w:rPr>
-                <w:lang w:val="es-ES"/>
-              </w:rPr>
-            </w:pPr>
-          </w:p>
-          <w:p>
-            <w:pPr>
-              <w:rPr>
-                <w:lang w:val="es-ES"/>
-              </w:rPr>
-            </w:pPr>
-            <w:proofErr w:type="spellStart"/>
-            <w:r>
-              <w:rPr>
-                <w:lang w:val="es-ES"/>
-              </w:rPr>
-              <w:t>Deselect</w:t>
-            </w:r>
-            <w:proofErr w:type="spellEnd"/>
-            <w:r>
-              <w:rPr>
-                <w:lang w:val="es-ES"/>
-              </w:rPr>
-              <w:t>:</w:t>
-            </w:r>
-          </w:p>
-          <w:p>
-            <w:pPr>
-              <w:rPr>
-                <w:lang w:val="es-ES"/>
-              </w:rPr>
-            </w:pPr>
-            <w:r>
-              <w:rPr>
-                <w:lang w:val="es-ES"/>
-              </w:rPr>
-              <w:t>“</w:t>
-            </w:r>
-            <w:r>
-              <w:rPr>
-                <w:lang w:val="es-ES"/>
-              </w:rPr>
-              <w:t>Volkswagen</w:t>
-            </w:r>
-            <w:r>
-              <w:rPr>
-                <w:lang w:val="es-ES"/>
-              </w:rPr>
-              <w:t xml:space="preserve"> Pickup </w:t>
-            </w:r>
-            <w:proofErr w:type="spellStart"/>
-            <w:r>
-              <w:rPr>
-                <w:lang w:val="es-ES"/>
-              </w:rPr>
-              <w:t>Truck</w:t>
-            </w:r>
-            <w:proofErr w:type="spellEnd"/>
-            <w:r>
-              <w:rPr>
-                <w:lang w:val="es-ES"/>
-              </w:rPr>
-              <w:t>”</w:t>
-            </w:r>
-          </w:p>
-        </w:tc>
-        <w:tc>
-          <w:tcPr>
-            <w:tcW w:w="992" w:type="dxa"/>
-          </w:tcPr>
-          <w:p>
-            <w:pPr>
-              <w:rPr>
-                <w:lang w:val="es-ES"/>
-              </w:rPr>
-            </w:pPr>
-          </w:p>
-        </w:tc>
-        <w:tc>
-          <w:tcPr>
-            <w:tcW w:w="992" w:type="dxa"/>
-          </w:tcPr>
-          <w:p>
-            <w:pPr>
-              <w:rPr>
-                <w:lang w:val="es-ES"/>
-              </w:rPr>
-            </w:pPr>
-          </w:p>
-        </w:tc>
-        <w:tc>
-          <w:tcPr>
-            <w:tcW w:w="1134" w:type="dxa"/>
-          </w:tcPr>
-          <w:p>
-            <w:pPr>
-              <w:rPr>
-                <w:lang w:val="es-ES"/>
-              </w:rPr>
-            </w:pPr>
-            <w:r>
-              <w:rPr>
-                <w:lang w:val="es-ES"/>
-              </w:rPr>
-              <w:t>Today+2</w:t>
-            </w:r>
-          </w:p>
-        </w:tc>
-        <w:tc>
-          <w:tcPr>
-            <w:tcW w:w="1134" w:type="dxa"/>
-          </w:tcPr>
-          <w:p>
-            <w:pPr>
-              <w:rPr>
-                <w:lang w:val="es-ES"/>
-              </w:rPr>
-            </w:pPr>
-            <w:r>
-              <w:rPr>
-                <w:lang w:val="es-ES"/>
-              </w:rPr>
-              <w:t>Today+3</w:t>
-            </w:r>
-          </w:p>
-        </w:tc>
-        <w:tc>
-          <w:tcPr>
-            <w:tcW w:w="1276" w:type="dxa"/>
-          </w:tcPr>
-          <w:p>
-            <w:pPr>
-              <w:rPr>
-                <w:lang w:val="es-ES"/>
-              </w:rPr>
-            </w:pPr>
-            <w:r>
-              <w:rPr>
-                <w:lang w:val="es-ES"/>
-              </w:rPr>
-              <w:t>Today+1</w:t>
-            </w:r>
-          </w:p>
-        </w:tc>
-        <w:tc>
-          <w:tcPr>
-            <w:tcW w:w="1984" w:type="dxa"/>
-          </w:tcPr>
-          <w:p>
-            <w:pPr>
-              <w:rPr>
-                <w:lang w:val="es-ES"/>
-              </w:rPr>
-            </w:pPr>
-          </w:p>
-        </w:tc>
-        <w:tc>
-          <w:tcPr>
-            <w:tcW w:w="2268" w:type="dxa"/>
-          </w:tcPr>
-          <w:p>
-            <w:r>
-              <w:t>Shown:</w:t>
-            </w:r>
-          </w:p>
-          <w:p>
-            <w:pPr>
-              <w:rPr>
-                <w:u w:val="single"/>
-              </w:rPr>
-            </w:pPr>
-            <w:r>
-              <w:t>“Audi Sedan – 280€, Total Price: 280€”</w:t>
+              <w:t xml:space="preserve"> </w:t>
+            </w:r>
+            <w:r>
+              <w:t>Pickup Truck</w:t>
+            </w:r>
+            <w:r>
+              <w:t xml:space="preserve"> – 80€, Total Price: 80€”</w:t>
             </w:r>
           </w:p>
         </w:tc>
@@ -4857,44 +4689,58 @@
                 <w:lang w:val="es-ES"/>
               </w:rPr>
             </w:pPr>
+            <w:r>
+              <w:rPr>
+                <w:lang w:val="es-ES"/>
+              </w:rPr>
+              <w:t>Modificar</w:t>
+            </w:r>
+            <w:r>
+              <w:rPr>
+                <w:lang w:val="es-ES"/>
+              </w:rPr>
+              <w:t xml:space="preserve"> coches seleccionados</w:t>
+            </w:r>
+          </w:p>
+        </w:tc>
+        <w:tc>
+          <w:tcPr>
+            <w:tcW w:w="1701" w:type="dxa"/>
+          </w:tcPr>
+          <w:p>
+            <w:r>
+              <w:t>Select:</w:t>
+            </w:r>
+          </w:p>
+          <w:p>
+            <w:r>
+              <w:t>“Volkswagen Pickup Truck”,</w:t>
+            </w:r>
+          </w:p>
+          <w:p>
+            <w:r>
+              <w:t>“Audi Sedan”,</w:t>
+            </w:r>
+          </w:p>
+          <w:p/>
+          <w:p>
+            <w:pPr>
+              <w:rPr>
+                <w:lang w:val="es-ES"/>
+              </w:rPr>
+            </w:pPr>
             <w:proofErr w:type="spellStart"/>
             <w:r>
               <w:rPr>
                 <w:lang w:val="es-ES"/>
               </w:rPr>
-              <w:t>Módificar</w:t>
+              <w:t>Deselect</w:t>
             </w:r>
             <w:proofErr w:type="spellEnd"/>
             <w:r>
               <w:rPr>
                 <w:lang w:val="es-ES"/>
               </w:rPr>
-              <w:t xml:space="preserve"> coches seleccionados</w:t>
-            </w:r>
-          </w:p>
-        </w:tc>
-        <w:tc>
-          <w:tcPr>
-            <w:tcW w:w="1701" w:type="dxa"/>
-          </w:tcPr>
-          <w:p>
-            <w:pPr>
-              <w:rPr>
-                <w:lang w:val="es-ES"/>
-              </w:rPr>
-            </w:pPr>
-            <w:proofErr w:type="spellStart"/>
-            <w:r>
-              <w:rPr>
-                <w:lang w:val="es-ES"/>
-              </w:rPr>
-              <w:t>Select</w:t>
-            </w:r>
-            <w:proofErr w:type="spellEnd"/>
-            <w:r>
-              <w:rPr>
-                <w:lang w:val="es-ES"/>
-              </w:rPr>
               <w:t>:</w:t>
             </w:r>
           </w:p>
@@ -4911,215 +4757,135 @@
               <w:t>“</w:t>
             </w:r>
             <w:r>
-              <w:rPr>
-                <w:lang w:val="es-ES"/>
-              </w:rPr>
+              <w:t>Audi Sedan</w:t>
+            </w:r>
+            <w:r>
+              <w:rPr>
+                <w:lang w:val="es-ES"/>
+              </w:rPr>
+              <w:t>”</w:t>
+            </w:r>
+          </w:p>
+        </w:tc>
+        <w:tc>
+          <w:tcPr>
+            <w:tcW w:w="992" w:type="dxa"/>
+          </w:tcPr>
+          <w:p>
+            <w:pPr>
+              <w:rPr>
+                <w:lang w:val="es-ES"/>
+              </w:rPr>
+            </w:pPr>
+          </w:p>
+        </w:tc>
+        <w:tc>
+          <w:tcPr>
+            <w:tcW w:w="992" w:type="dxa"/>
+          </w:tcPr>
+          <w:p>
+            <w:pPr>
+              <w:rPr>
+                <w:lang w:val="es-ES"/>
+              </w:rPr>
+            </w:pPr>
+          </w:p>
+        </w:tc>
+        <w:tc>
+          <w:tcPr>
+            <w:tcW w:w="1134" w:type="dxa"/>
+          </w:tcPr>
+          <w:p>
+            <w:pPr>
+              <w:rPr>
+                <w:lang w:val="es-ES"/>
+              </w:rPr>
+            </w:pPr>
+            <w:r>
+              <w:rPr>
+                <w:lang w:val="es-ES"/>
+              </w:rPr>
+              <w:t>Today+2</w:t>
+            </w:r>
+          </w:p>
+        </w:tc>
+        <w:tc>
+          <w:tcPr>
+            <w:tcW w:w="1134" w:type="dxa"/>
+          </w:tcPr>
+          <w:p>
+            <w:pPr>
+              <w:rPr>
+                <w:lang w:val="es-ES"/>
+              </w:rPr>
+            </w:pPr>
+            <w:r>
+              <w:rPr>
+                <w:lang w:val="es-ES"/>
+              </w:rPr>
+              <w:t>Today+3</w:t>
+            </w:r>
+          </w:p>
+        </w:tc>
+        <w:tc>
+          <w:tcPr>
+            <w:tcW w:w="1276" w:type="dxa"/>
+          </w:tcPr>
+          <w:p>
+            <w:pPr>
+              <w:rPr>
+                <w:lang w:val="es-ES"/>
+              </w:rPr>
+            </w:pPr>
+            <w:r>
+              <w:rPr>
+                <w:lang w:val="es-ES"/>
+              </w:rPr>
+              <w:t>Today+1</w:t>
+            </w:r>
+          </w:p>
+        </w:tc>
+        <w:tc>
+          <w:tcPr>
+            <w:tcW w:w="1984" w:type="dxa"/>
+          </w:tcPr>
+          <w:p>
+            <w:pPr>
+              <w:rPr>
+                <w:lang w:val="es-ES"/>
+              </w:rPr>
+            </w:pPr>
+          </w:p>
+        </w:tc>
+        <w:tc>
+          <w:tcPr>
+            <w:tcW w:w="2268" w:type="dxa"/>
+          </w:tcPr>
+          <w:p>
+            <w:r>
+              <w:t>Shown:</w:t>
+            </w:r>
+          </w:p>
+          <w:p>
+            <w:pPr>
+              <w:rPr>
+                <w:u w:val="single"/>
+              </w:rPr>
+            </w:pPr>
+            <w:r>
+              <w:t>“</w:t>
+            </w:r>
+            <w:r>
               <w:t>Volkswagen</w:t>
             </w:r>
             <w:r>
-              <w:rPr>
-                <w:lang w:val="es-ES"/>
-              </w:rPr>
-              <w:t xml:space="preserve"> Pickup </w:t>
-            </w:r>
-            <w:proofErr w:type="spellStart"/>
-            <w:r>
-              <w:rPr>
-                <w:lang w:val="es-ES"/>
-              </w:rPr>
-              <w:t>Truck</w:t>
-            </w:r>
-            <w:proofErr w:type="spellEnd"/>
-            <w:r>
-              <w:rPr>
-                <w:lang w:val="es-ES"/>
-              </w:rPr>
-              <w:t>”,</w:t>
-            </w:r>
-          </w:p>
-          <w:p>
-            <w:pPr>
-              <w:rPr>
-                <w:lang w:val="es-ES"/>
-              </w:rPr>
-            </w:pPr>
-            <w:r>
-              <w:rPr>
-                <w:lang w:val="es-ES"/>
-              </w:rPr>
-              <w:t>“Audi Sedan”,</w:t>
-            </w:r>
-          </w:p>
-          <w:p>
-            <w:pPr>
-              <w:rPr>
-                <w:lang w:val="es-ES"/>
-              </w:rPr>
-            </w:pPr>
-          </w:p>
-          <w:p>
-            <w:pPr>
-              <w:rPr>
-                <w:lang w:val="es-ES"/>
-              </w:rPr>
-            </w:pPr>
-            <w:proofErr w:type="spellStart"/>
-            <w:r>
-              <w:rPr>
-                <w:lang w:val="es-ES"/>
-              </w:rPr>
-              <w:t>Deselect</w:t>
-            </w:r>
-            <w:proofErr w:type="spellEnd"/>
-            <w:r>
-              <w:rPr>
-                <w:lang w:val="es-ES"/>
-              </w:rPr>
-              <w:t>:</w:t>
-            </w:r>
-          </w:p>
-          <w:p>
-            <w:pPr>
-              <w:rPr>
-                <w:lang w:val="es-ES"/>
-              </w:rPr>
-            </w:pPr>
-            <w:r>
-              <w:rPr>
-                <w:lang w:val="es-ES"/>
-              </w:rPr>
-              <w:t>“</w:t>
-            </w:r>
-            <w:r>
-              <w:rPr>
-                <w:lang w:val="es-ES"/>
-              </w:rPr>
-              <w:t>Volkswagen</w:t>
-            </w:r>
-            <w:r>
-              <w:rPr>
-                <w:lang w:val="es-ES"/>
-              </w:rPr>
-              <w:t xml:space="preserve"> Pickup </w:t>
-            </w:r>
-            <w:proofErr w:type="spellStart"/>
-            <w:r>
-              <w:rPr>
-                <w:lang w:val="es-ES"/>
-              </w:rPr>
-              <w:t>Truck</w:t>
-            </w:r>
-            <w:proofErr w:type="spellEnd"/>
-            <w:r>
-              <w:rPr>
-                <w:lang w:val="es-ES"/>
-              </w:rPr>
-              <w:t>”</w:t>
-            </w:r>
-          </w:p>
-        </w:tc>
-        <w:tc>
-          <w:tcPr>
-            <w:tcW w:w="992" w:type="dxa"/>
-          </w:tcPr>
-          <w:p>
-            <w:pPr>
-              <w:rPr>
-                <w:lang w:val="es-ES"/>
-              </w:rPr>
-            </w:pPr>
-          </w:p>
-        </w:tc>
-        <w:tc>
-          <w:tcPr>
-            <w:tcW w:w="992" w:type="dxa"/>
-          </w:tcPr>
-          <w:p>
-            <w:pPr>
-              <w:rPr>
-                <w:lang w:val="es-ES"/>
-              </w:rPr>
-            </w:pPr>
-          </w:p>
-        </w:tc>
-        <w:tc>
-          <w:tcPr>
-            <w:tcW w:w="1134" w:type="dxa"/>
-          </w:tcPr>
-          <w:p>
-            <w:pPr>
-              <w:rPr>
-                <w:lang w:val="es-ES"/>
-              </w:rPr>
-            </w:pPr>
-            <w:r>
-              <w:rPr>
-                <w:lang w:val="es-ES"/>
-              </w:rPr>
-              <w:t>Today+2</w:t>
-            </w:r>
-          </w:p>
-        </w:tc>
-        <w:tc>
-          <w:tcPr>
-            <w:tcW w:w="1134" w:type="dxa"/>
-          </w:tcPr>
-          <w:p>
-            <w:pPr>
-              <w:rPr>
-                <w:lang w:val="es-ES"/>
-              </w:rPr>
-            </w:pPr>
-            <w:r>
-              <w:rPr>
-                <w:lang w:val="es-ES"/>
-              </w:rPr>
-              <w:t>Today+3</w:t>
-            </w:r>
-          </w:p>
-        </w:tc>
-        <w:tc>
-          <w:tcPr>
-            <w:tcW w:w="1276" w:type="dxa"/>
-          </w:tcPr>
-          <w:p>
-            <w:pPr>
-              <w:rPr>
-                <w:lang w:val="es-ES"/>
-              </w:rPr>
-            </w:pPr>
-            <w:r>
-              <w:rPr>
-                <w:lang w:val="es-ES"/>
-              </w:rPr>
-              <w:t>Today+1</w:t>
-            </w:r>
-          </w:p>
-        </w:tc>
-        <w:tc>
-          <w:tcPr>
-            <w:tcW w:w="1984" w:type="dxa"/>
-          </w:tcPr>
-          <w:p>
-            <w:pPr>
-              <w:rPr>
-                <w:lang w:val="es-ES"/>
-              </w:rPr>
-            </w:pPr>
-          </w:p>
-        </w:tc>
-        <w:tc>
-          <w:tcPr>
-            <w:tcW w:w="2268" w:type="dxa"/>
-          </w:tcPr>
-          <w:p>
-            <w:r>
-              <w:t>Shown:</w:t>
-            </w:r>
-          </w:p>
-          <w:p>
-            <w:r>
-              <w:t>“Audi Sedan – 280€, Total Price: 280€”</w:t>
+              <w:t xml:space="preserve"> </w:t>
+            </w:r>
+            <w:r>
+              <w:t>Pickup Truck</w:t>
+            </w:r>
+            <w:r>
+              <w:t xml:space="preserve"> – 80€, Total Price: 80€”</w:t>
             </w:r>
           </w:p>
         </w:tc>
@@ -5401,8 +5167,8 @@
       </w:r>
       <w:bookmarkEnd w:id="11"/>
     </w:p>
-    <w:bookmarkEnd w:id="0"/>
     <w:bookmarkEnd w:id="1"/>
+    <w:bookmarkEnd w:id="2"/>
     <w:p>
       <w:pPr>
         <w:ind w:left="708"/>

</xml_diff>